<commit_message>
Update report with component diagram and application screenshots.
Embed Assignment II Figure 1b (code-aligned Mermaid component view) and
application screenshots in report/179.docx. Add docs/component_diagram
source and PNG; refresh architecture.md and README links.
</commit_message>
<xml_diff>
--- a/report/179.docx
+++ b/report/179.docx
@@ -1940,6 +1940,75 @@
     </w:p>
     <w:p>
       <w:pPr>
+        <w:spacing w:after="120"/>
+      </w:pPr>
+      <w:r>
+        <w:rPr>
+          <w:rFonts w:ascii="Calibri" w:hAnsi="Calibri" w:eastAsia="Calibri"/>
+          <w:b w:val="0"/>
+          <w:i w:val="0"/>
+          <w:sz w:val="22"/>
+        </w:rPr>
+        <w:t>Component view (classes, modules, and key functions) verified against source imports and call paths. Streamlit and FastAPI both call the shared ResumeScreeningApplication; ResumeScoringService uses ModelPredictor and clean_text; train.py drives offline training through ml.data and ml.trainer with quality gates. Editable Mermaid source: docs/component_diagram.mmd.</w:t>
+      </w:r>
+    </w:p>
+    <w:p>
+      <w:pPr>
+        <w:jc w:val="center"/>
+      </w:pPr>
+      <w:r>
+        <w:drawing>
+          <wp:inline xmlns:a="http://schemas.openxmlformats.org/drawingml/2006/main" xmlns:pic="http://schemas.openxmlformats.org/drawingml/2006/picture">
+            <wp:extent cx="5852160" cy="1910909"/>
+            <wp:docPr id="9" name="Picture 9"/>
+            <wp:cNvGraphicFramePr>
+              <a:graphicFrameLocks noChangeAspect="1"/>
+            </wp:cNvGraphicFramePr>
+            <a:graphic>
+              <a:graphicData uri="http://schemas.openxmlformats.org/drawingml/2006/picture">
+                <pic:pic>
+                  <pic:nvPicPr>
+                    <pic:cNvPr id="0" name="component_diagram.png"/>
+                    <pic:cNvPicPr/>
+                  </pic:nvPicPr>
+                  <pic:blipFill>
+                    <a:blip r:embed="rId20"/>
+                    <a:stretch>
+                      <a:fillRect/>
+                    </a:stretch>
+                  </pic:blipFill>
+                  <pic:spPr>
+                    <a:xfrm>
+                      <a:off x="0" y="0"/>
+                      <a:ext cx="5852160" cy="1910909"/>
+                    </a:xfrm>
+                    <a:prstGeom prst="rect"/>
+                  </pic:spPr>
+                </pic:pic>
+              </a:graphicData>
+            </a:graphic>
+          </wp:inline>
+        </w:drawing>
+      </w:r>
+    </w:p>
+    <w:p>
+      <w:pPr>
+        <w:spacing w:before="80" w:after="200"/>
+        <w:jc w:val="center"/>
+      </w:pPr>
+      <w:r>
+        <w:rPr>
+          <w:rFonts w:ascii="Calibri" w:hAnsi="Calibri" w:eastAsia="Calibri"/>
+          <w:b w:val="0"/>
+          <w:i/>
+          <w:color w:val="333333"/>
+          <w:sz w:val="20"/>
+        </w:rPr>
+        <w:t>Figure 1b. Production component diagram aligned with the codebase: clients/entrypoints (Streamlit, FastAPI, train.py), domain services (classes), ML lifecycle modules, quality metrics, artifacts, and config/logging. Solid edges are runtime or train dependencies; dotted edges are cross-cutting config and logging. Composition wiring of ModelPredictor into services is done inside API/Streamlit get/load helpers (omitted as construction detail).</w:t>
+      </w:r>
+    </w:p>
+    <w:p>
+      <w:pPr>
         <w:spacing w:before="0" w:after="120" w:line="264" w:lineRule="auto"/>
       </w:pPr>
       <w:r>
@@ -3756,6 +3825,20 @@
         <w:br/>
         <w:br/>
         <w:t>GET /health with missing artifact -&gt; 503</w:t>
+      </w:r>
+    </w:p>
+    <w:p>
+      <w:pPr>
+        <w:spacing w:after="160"/>
+      </w:pPr>
+      <w:r>
+        <w:rPr>
+          <w:rFonts w:ascii="Calibri" w:hAnsi="Calibri" w:eastAsia="Calibri"/>
+          <w:b w:val="0"/>
+          <w:i w:val="0"/>
+          <w:sz w:val="22"/>
+        </w:rPr>
+        <w:t>Runtime evidence for these endpoints is shown in Application screenshots (Figures 4–8): OpenAPI /docs, health check, prediction request/response, and metrics snapshot.</w:t>
       </w:r>
     </w:p>
     <w:p>
@@ -5610,6 +5693,496 @@
     <w:p>
       <w:pPr>
         <w:pStyle w:val="Heading1"/>
+      </w:pPr>
+      <w:r>
+        <w:rPr>
+          <w:rFonts w:ascii="Calibri" w:hAnsi="Calibri" w:eastAsia="Calibri"/>
+          <w:b/>
+          <w:i w:val="0"/>
+          <w:sz w:val="32"/>
+        </w:rPr>
+        <w:t>Application screenshots</w:t>
+      </w:r>
+    </w:p>
+    <w:p>
+      <w:pPr>
+        <w:spacing w:after="160"/>
+      </w:pPr>
+      <w:r>
+        <w:rPr>
+          <w:rFonts w:ascii="Calibri" w:hAnsi="Calibri" w:eastAsia="Calibri"/>
+          <w:b w:val="0"/>
+          <w:i w:val="0"/>
+          <w:sz w:val="22"/>
+        </w:rPr>
+        <w:t>The following screenshots demonstrate the running Assignment II system: the preserved recruiter UI (Streamlit) and the production-style FastAPI inference interface required by the assignment submission guidelines.</w:t>
+      </w:r>
+    </w:p>
+    <w:p>
+      <w:pPr>
+        <w:pStyle w:val="Heading2"/>
+      </w:pPr>
+      <w:r>
+        <w:rPr>
+          <w:rFonts w:ascii="Calibri" w:hAnsi="Calibri" w:eastAsia="Calibri"/>
+          <w:b/>
+          <w:i w:val="0"/>
+          <w:sz w:val="26"/>
+        </w:rPr>
+        <w:t>A. Recruiter application (Streamlit)</w:t>
+      </w:r>
+    </w:p>
+    <w:p>
+      <w:pPr>
+        <w:spacing w:after="160"/>
+      </w:pPr>
+      <w:r>
+        <w:rPr>
+          <w:rFonts w:ascii="Calibri" w:hAnsi="Calibri" w:eastAsia="Calibri"/>
+          <w:b w:val="0"/>
+          <w:i w:val="0"/>
+          <w:sz w:val="22"/>
+        </w:rPr>
+        <w:t>The Streamlit app preserves the Assignment I workflow (candidate name, TXT/PDF/DOCX upload or paste, analysis, explanation, and audit history) while routing scoring through the shared modular ResumeScreeningApplication service.</w:t>
+      </w:r>
+    </w:p>
+    <w:p>
+      <w:pPr>
+        <w:spacing w:before="120" w:after="40"/>
+        <w:jc w:val="center"/>
+      </w:pPr>
+      <w:r>
+        <w:drawing>
+          <wp:inline xmlns:a="http://schemas.openxmlformats.org/drawingml/2006/main" xmlns:pic="http://schemas.openxmlformats.org/drawingml/2006/picture">
+            <wp:extent cx="5760720" cy="3102619"/>
+            <wp:docPr id="2" name="Picture 2"/>
+            <wp:cNvGraphicFramePr>
+              <a:graphicFrameLocks noChangeAspect="1"/>
+            </wp:cNvGraphicFramePr>
+            <a:graphic>
+              <a:graphicData uri="http://schemas.openxmlformats.org/drawingml/2006/picture">
+                <pic:pic>
+                  <pic:nvPicPr>
+                    <pic:cNvPr id="0" name="MainApp.png"/>
+                    <pic:cNvPicPr/>
+                  </pic:nvPicPr>
+                  <pic:blipFill>
+                    <a:blip r:embed="rId12"/>
+                    <a:stretch>
+                      <a:fillRect/>
+                    </a:stretch>
+                  </pic:blipFill>
+                  <pic:spPr>
+                    <a:xfrm>
+                      <a:off x="0" y="0"/>
+                      <a:ext cx="5760720" cy="3102619"/>
+                    </a:xfrm>
+                    <a:prstGeom prst="rect"/>
+                  </pic:spPr>
+                </pic:pic>
+              </a:graphicData>
+            </a:graphic>
+          </wp:inline>
+        </w:drawing>
+      </w:r>
+    </w:p>
+    <w:p>
+      <w:pPr>
+        <w:spacing w:before="80" w:after="240"/>
+        <w:jc w:val="center"/>
+      </w:pPr>
+      <w:r>
+        <w:rPr>
+          <w:rFonts w:ascii="Calibri" w:hAnsi="Calibri" w:eastAsia="Calibri"/>
+          <w:b w:val="0"/>
+          <w:i/>
+          <w:color w:val="333333"/>
+          <w:sz w:val="20"/>
+        </w:rPr>
+        <w:t>Figure 2. Main recruiter UI — upload/paste controls, verified model quality sidebar, and privacy-aware audit history (no raw resume text stored).</w:t>
+      </w:r>
+    </w:p>
+    <w:p>
+      <w:pPr>
+        <w:spacing w:before="120" w:after="40"/>
+        <w:jc w:val="center"/>
+      </w:pPr>
+      <w:r>
+        <w:drawing>
+          <wp:inline xmlns:a="http://schemas.openxmlformats.org/drawingml/2006/main" xmlns:pic="http://schemas.openxmlformats.org/drawingml/2006/picture">
+            <wp:extent cx="5760720" cy="3093608"/>
+            <wp:docPr id="3" name="Picture 3"/>
+            <wp:cNvGraphicFramePr>
+              <a:graphicFrameLocks noChangeAspect="1"/>
+            </wp:cNvGraphicFramePr>
+            <a:graphic>
+              <a:graphicData uri="http://schemas.openxmlformats.org/drawingml/2006/picture">
+                <pic:pic>
+                  <pic:nvPicPr>
+                    <pic:cNvPr id="0" name="AppSampleResume.png"/>
+                    <pic:cNvPicPr/>
+                  </pic:nvPicPr>
+                  <pic:blipFill>
+                    <a:blip r:embed="rId13"/>
+                    <a:stretch>
+                      <a:fillRect/>
+                    </a:stretch>
+                  </pic:blipFill>
+                  <pic:spPr>
+                    <a:xfrm>
+                      <a:off x="0" y="0"/>
+                      <a:ext cx="5760720" cy="3093608"/>
+                    </a:xfrm>
+                    <a:prstGeom prst="rect"/>
+                  </pic:spPr>
+                </pic:pic>
+              </a:graphicData>
+            </a:graphic>
+          </wp:inline>
+        </w:drawing>
+      </w:r>
+    </w:p>
+    <w:p>
+      <w:pPr>
+        <w:spacing w:before="80" w:after="240"/>
+        <w:jc w:val="center"/>
+      </w:pPr>
+      <w:r>
+        <w:rPr>
+          <w:rFonts w:ascii="Calibri" w:hAnsi="Calibri" w:eastAsia="Calibri"/>
+          <w:b w:val="0"/>
+          <w:i/>
+          <w:color w:val="333333"/>
+          <w:sz w:val="20"/>
+        </w:rPr>
+        <w:t>Figure 3. Sample resume analysis — predicted role, confidence, keyword explanation, advisory decision note, and role ranking table.</w:t>
+      </w:r>
+    </w:p>
+    <w:p>
+      <w:pPr>
+        <w:pStyle w:val="Heading2"/>
+      </w:pPr>
+      <w:r>
+        <w:rPr>
+          <w:rFonts w:ascii="Calibri" w:hAnsi="Calibri" w:eastAsia="Calibri"/>
+          <w:b/>
+          <w:i w:val="0"/>
+          <w:sz w:val="26"/>
+        </w:rPr>
+        <w:t>B. REST API (FastAPI / OpenAPI)</w:t>
+      </w:r>
+    </w:p>
+    <w:p>
+      <w:pPr>
+        <w:spacing w:after="160"/>
+      </w:pPr>
+      <w:r>
+        <w:rPr>
+          <w:rFonts w:ascii="Calibri" w:hAnsi="Calibri" w:eastAsia="Calibri"/>
+          <w:b w:val="0"/>
+          <w:i w:val="0"/>
+          <w:sz w:val="22"/>
+        </w:rPr>
+        <w:t>The FastAPI service exposes typed health, prediction, and metrics endpoints with OpenAPI documentation at /docs. Request and response schemas are defined in app/schemas.py; inference uses the same application service as Streamlit.</w:t>
+      </w:r>
+    </w:p>
+    <w:p>
+      <w:pPr>
+        <w:spacing w:before="120" w:after="40"/>
+        <w:jc w:val="center"/>
+      </w:pPr>
+      <w:r>
+        <w:drawing>
+          <wp:inline xmlns:a="http://schemas.openxmlformats.org/drawingml/2006/main" xmlns:pic="http://schemas.openxmlformats.org/drawingml/2006/picture">
+            <wp:extent cx="5760720" cy="3084598"/>
+            <wp:docPr id="4" name="Picture 4"/>
+            <wp:cNvGraphicFramePr>
+              <a:graphicFrameLocks noChangeAspect="1"/>
+            </wp:cNvGraphicFramePr>
+            <a:graphic>
+              <a:graphicData uri="http://schemas.openxmlformats.org/drawingml/2006/picture">
+                <pic:pic>
+                  <pic:nvPicPr>
+                    <pic:cNvPr id="0" name="APISpec.png"/>
+                    <pic:cNvPicPr/>
+                  </pic:nvPicPr>
+                  <pic:blipFill>
+                    <a:blip r:embed="rId14"/>
+                    <a:stretch>
+                      <a:fillRect/>
+                    </a:stretch>
+                  </pic:blipFill>
+                  <pic:spPr>
+                    <a:xfrm>
+                      <a:off x="0" y="0"/>
+                      <a:ext cx="5760720" cy="3084598"/>
+                    </a:xfrm>
+                    <a:prstGeom prst="rect"/>
+                  </pic:spPr>
+                </pic:pic>
+              </a:graphicData>
+            </a:graphic>
+          </wp:inline>
+        </w:drawing>
+      </w:r>
+    </w:p>
+    <w:p>
+      <w:pPr>
+        <w:spacing w:before="80" w:after="240"/>
+        <w:jc w:val="center"/>
+      </w:pPr>
+      <w:r>
+        <w:rPr>
+          <w:rFonts w:ascii="Calibri" w:hAnsi="Calibri" w:eastAsia="Calibri"/>
+          <w:b w:val="0"/>
+          <w:i/>
+          <w:color w:val="333333"/>
+          <w:sz w:val="20"/>
+        </w:rPr>
+        <w:t>Figure 4. OpenAPI specification — GET /health, POST /v1/predictions, POST /predict, GET /metrics, and generated schema models.</w:t>
+      </w:r>
+    </w:p>
+    <w:p>
+      <w:pPr>
+        <w:spacing w:before="120" w:after="40"/>
+        <w:jc w:val="center"/>
+      </w:pPr>
+      <w:r>
+        <w:drawing>
+          <wp:inline xmlns:a="http://schemas.openxmlformats.org/drawingml/2006/main" xmlns:pic="http://schemas.openxmlformats.org/drawingml/2006/picture">
+            <wp:extent cx="5486400" cy="1133699"/>
+            <wp:docPr id="5" name="Picture 5"/>
+            <wp:cNvGraphicFramePr>
+              <a:graphicFrameLocks noChangeAspect="1"/>
+            </wp:cNvGraphicFramePr>
+            <a:graphic>
+              <a:graphicData uri="http://schemas.openxmlformats.org/drawingml/2006/picture">
+                <pic:pic>
+                  <pic:nvPicPr>
+                    <pic:cNvPr id="0" name="FastHeatlthCheck.png"/>
+                    <pic:cNvPicPr/>
+                  </pic:nvPicPr>
+                  <pic:blipFill>
+                    <a:blip r:embed="rId15"/>
+                    <a:stretch>
+                      <a:fillRect/>
+                    </a:stretch>
+                  </pic:blipFill>
+                  <pic:spPr>
+                    <a:xfrm>
+                      <a:off x="0" y="0"/>
+                      <a:ext cx="5486400" cy="1133699"/>
+                    </a:xfrm>
+                    <a:prstGeom prst="rect"/>
+                  </pic:spPr>
+                </pic:pic>
+              </a:graphicData>
+            </a:graphic>
+          </wp:inline>
+        </w:drawing>
+      </w:r>
+    </w:p>
+    <w:p>
+      <w:pPr>
+        <w:spacing w:before="80" w:after="240"/>
+        <w:jc w:val="center"/>
+      </w:pPr>
+      <w:r>
+        <w:rPr>
+          <w:rFonts w:ascii="Calibri" w:hAnsi="Calibri" w:eastAsia="Calibri"/>
+          <w:b w:val="0"/>
+          <w:i/>
+          <w:color w:val="333333"/>
+          <w:sz w:val="20"/>
+        </w:rPr>
+        <w:t>Figure 5. GET /health — service ready with model_loaded=true and API version 2.1.0.</w:t>
+      </w:r>
+    </w:p>
+    <w:p>
+      <w:pPr>
+        <w:spacing w:before="120" w:after="40"/>
+        <w:jc w:val="center"/>
+      </w:pPr>
+      <w:r>
+        <w:drawing>
+          <wp:inline xmlns:a="http://schemas.openxmlformats.org/drawingml/2006/main" xmlns:pic="http://schemas.openxmlformats.org/drawingml/2006/picture">
+            <wp:extent cx="5760720" cy="3093608"/>
+            <wp:docPr id="6" name="Picture 6"/>
+            <wp:cNvGraphicFramePr>
+              <a:graphicFrameLocks noChangeAspect="1"/>
+            </wp:cNvGraphicFramePr>
+            <a:graphic>
+              <a:graphicData uri="http://schemas.openxmlformats.org/drawingml/2006/picture">
+                <pic:pic>
+                  <pic:nvPicPr>
+                    <pic:cNvPr id="0" name="APIExecution_Predict_1.png"/>
+                    <pic:cNvPicPr/>
+                  </pic:nvPicPr>
+                  <pic:blipFill>
+                    <a:blip r:embed="rId16"/>
+                    <a:stretch>
+                      <a:fillRect/>
+                    </a:stretch>
+                  </pic:blipFill>
+                  <pic:spPr>
+                    <a:xfrm>
+                      <a:off x="0" y="0"/>
+                      <a:ext cx="5760720" cy="3093608"/>
+                    </a:xfrm>
+                    <a:prstGeom prst="rect"/>
+                  </pic:spPr>
+                </pic:pic>
+              </a:graphicData>
+            </a:graphic>
+          </wp:inline>
+        </w:drawing>
+      </w:r>
+    </w:p>
+    <w:p>
+      <w:pPr>
+        <w:spacing w:before="80" w:after="240"/>
+        <w:jc w:val="center"/>
+      </w:pPr>
+      <w:r>
+        <w:rPr>
+          <w:rFonts w:ascii="Calibri" w:hAnsi="Calibri" w:eastAsia="Calibri"/>
+          <w:b w:val="0"/>
+          <w:i/>
+          <w:color w:val="333333"/>
+          <w:sz w:val="20"/>
+        </w:rPr>
+        <w:t>Figure 6. POST /v1/predictions — interactive request form (candidate_name, resume_text).</w:t>
+      </w:r>
+    </w:p>
+    <w:p>
+      <w:pPr>
+        <w:spacing w:before="120" w:after="40"/>
+        <w:jc w:val="center"/>
+      </w:pPr>
+      <w:r>
+        <w:drawing>
+          <wp:inline xmlns:a="http://schemas.openxmlformats.org/drawingml/2006/main" xmlns:pic="http://schemas.openxmlformats.org/drawingml/2006/picture">
+            <wp:extent cx="5760720" cy="3081594"/>
+            <wp:docPr id="7" name="Picture 7"/>
+            <wp:cNvGraphicFramePr>
+              <a:graphicFrameLocks noChangeAspect="1"/>
+            </wp:cNvGraphicFramePr>
+            <a:graphic>
+              <a:graphicData uri="http://schemas.openxmlformats.org/drawingml/2006/picture">
+                <pic:pic>
+                  <pic:nvPicPr>
+                    <pic:cNvPr id="0" name="APIExecution_Predict_2.png"/>
+                    <pic:cNvPicPr/>
+                  </pic:nvPicPr>
+                  <pic:blipFill>
+                    <a:blip r:embed="rId17"/>
+                    <a:stretch>
+                      <a:fillRect/>
+                    </a:stretch>
+                  </pic:blipFill>
+                  <pic:spPr>
+                    <a:xfrm>
+                      <a:off x="0" y="0"/>
+                      <a:ext cx="5760720" cy="3081594"/>
+                    </a:xfrm>
+                    <a:prstGeom prst="rect"/>
+                  </pic:spPr>
+                </pic:pic>
+              </a:graphicData>
+            </a:graphic>
+          </wp:inline>
+        </w:drawing>
+      </w:r>
+    </w:p>
+    <w:p>
+      <w:pPr>
+        <w:spacing w:before="80" w:after="240"/>
+        <w:jc w:val="center"/>
+      </w:pPr>
+      <w:r>
+        <w:rPr>
+          <w:rFonts w:ascii="Calibri" w:hAnsi="Calibri" w:eastAsia="Calibri"/>
+          <w:b w:val="0"/>
+          <w:i/>
+          <w:color w:val="333333"/>
+          <w:sz w:val="20"/>
+        </w:rPr>
+        <w:t>Figure 7. POST /v1/predictions — successful 200 response with predicted_role, confidence, role_ranking, explanation, and decision_note.</w:t>
+      </w:r>
+    </w:p>
+    <w:p>
+      <w:pPr>
+        <w:spacing w:before="120" w:after="40"/>
+        <w:jc w:val="center"/>
+      </w:pPr>
+      <w:r>
+        <w:drawing>
+          <wp:inline xmlns:a="http://schemas.openxmlformats.org/drawingml/2006/main" xmlns:pic="http://schemas.openxmlformats.org/drawingml/2006/picture">
+            <wp:extent cx="5760720" cy="3118745"/>
+            <wp:docPr id="8" name="Picture 8"/>
+            <wp:cNvGraphicFramePr>
+              <a:graphicFrameLocks noChangeAspect="1"/>
+            </wp:cNvGraphicFramePr>
+            <a:graphic>
+              <a:graphicData uri="http://schemas.openxmlformats.org/drawingml/2006/picture">
+                <pic:pic>
+                  <pic:nvPicPr>
+                    <pic:cNvPr id="0" name="API_PredictionMetrics.png"/>
+                    <pic:cNvPicPr/>
+                  </pic:nvPicPr>
+                  <pic:blipFill>
+                    <a:blip r:embed="rId18"/>
+                    <a:stretch>
+                      <a:fillRect/>
+                    </a:stretch>
+                  </pic:blipFill>
+                  <pic:spPr>
+                    <a:xfrm>
+                      <a:off x="0" y="0"/>
+                      <a:ext cx="5760720" cy="3118745"/>
+                    </a:xfrm>
+                    <a:prstGeom prst="rect"/>
+                  </pic:spPr>
+                </pic:pic>
+              </a:graphicData>
+            </a:graphic>
+          </wp:inline>
+        </w:drawing>
+      </w:r>
+    </w:p>
+    <w:p>
+      <w:pPr>
+        <w:spacing w:before="80" w:after="240"/>
+        <w:jc w:val="center"/>
+      </w:pPr>
+      <w:r>
+        <w:rPr>
+          <w:rFonts w:ascii="Calibri" w:hAnsi="Calibri" w:eastAsia="Calibri"/>
+          <w:b w:val="0"/>
+          <w:i/>
+          <w:color w:val="333333"/>
+          <w:sz w:val="20"/>
+        </w:rPr>
+        <w:t>Figure 8. GET /metrics — persisted model and data quality snapshot used for release evidence and UI sidebar metrics.</w:t>
+      </w:r>
+    </w:p>
+    <w:p>
+      <w:pPr>
+        <w:spacing w:after="160"/>
+      </w:pPr>
+      <w:r>
+        <w:rPr>
+          <w:rFonts w:ascii="Calibri" w:hAnsi="Calibri" w:eastAsia="Calibri"/>
+          <w:b w:val="0"/>
+          <w:i w:val="0"/>
+          <w:sz w:val="22"/>
+        </w:rPr>
+        <w:t>These screenshots, together with reports/pytest_report.txt and reports/lint_*.txt, constitute runtime evidence that the modular production package executes as described in Sections 5–8.</w:t>
+      </w:r>
+    </w:p>
+    <w:p>
+      <w:pPr>
+        <w:pStyle w:val="Heading1"/>
         <w:keepNext/>
       </w:pPr>
       <w:r>
@@ -5625,6 +6198,17 @@
           <w:rFonts w:ascii="Calibri" w:hAnsi="Calibri"/>
         </w:rPr>
         <w:t>The following files form the canonical submission. Earlier draft artifacts remain only as working history and are not required for grading.</w:t>
+      </w:r>
+    </w:p>
+    <w:p>
+      <w:r>
+        <w:rPr>
+          <w:rFonts w:ascii="Calibri" w:hAnsi="Calibri" w:eastAsia="Calibri"/>
+          <w:b w:val="0"/>
+          <w:i w:val="0"/>
+          <w:sz w:val="22"/>
+        </w:rPr>
+        <w:t>Application screenshots used in this report are stored under Screenshots/ (Streamlit UI and FastAPI /docs execution evidence).</w:t>
       </w:r>
     </w:p>
     <w:tbl>
@@ -6195,6 +6779,28 @@
           </w:p>
         </w:tc>
       </w:tr>
+      <w:tr>
+        <w:tc>
+          <w:tcPr>
+            <w:tcW w:type="dxa" w:w="3400"/>
+          </w:tcPr>
+          <w:p>
+            <w:r>
+              <w:t>Screenshots/</w:t>
+            </w:r>
+          </w:p>
+        </w:tc>
+        <w:tc>
+          <w:tcPr>
+            <w:tcW w:type="dxa" w:w="5960"/>
+          </w:tcPr>
+          <w:p>
+            <w:r>
+              <w:t>UI and API runtime screenshots embedded in Application screenshots section</w:t>
+            </w:r>
+          </w:p>
+        </w:tc>
+      </w:tr>
     </w:tbl>
     <w:p>
       <w:pPr>

</xml_diff>

<commit_message>
Update 179.docx paths after report/ consolidation.
</commit_message>
<xml_diff>
--- a/report/179.docx
+++ b/report/179.docx
@@ -1058,7 +1058,7 @@
                 <w:color w:val="000000"/>
                 <w:sz w:val="18"/>
               </w:rPr>
-              <w:t>reports/lint_before.txt and lint_after.txt</w:t>
+              <w:t>report/lint_before.txt and lint_after.txt</w:t>
             </w:r>
           </w:p>
         </w:tc>
@@ -1218,7 +1218,7 @@
                 <w:color w:val="000000"/>
                 <w:sz w:val="18"/>
               </w:rPr>
-              <w:t>35 tests; reports/pytest_report.txt</w:t>
+              <w:t>35 tests; report/pytest_report.txt</w:t>
             </w:r>
           </w:p>
         </w:tc>
@@ -1298,7 +1298,7 @@
                 <w:color w:val="000000"/>
                 <w:sz w:val="18"/>
               </w:rPr>
-              <w:t>reports/metrics_snapshot.json</w:t>
+              <w:t>report/metrics_snapshot.json</w:t>
             </w:r>
           </w:p>
         </w:tc>
@@ -6177,7 +6177,7 @@
           <w:i w:val="0"/>
           <w:sz w:val="22"/>
         </w:rPr>
-        <w:t>These screenshots, together with reports/pytest_report.txt and reports/lint_*.txt, constitute runtime evidence that the modular production package executes as described in Sections 5–8.</w:t>
+        <w:t>These screenshots, together with report/pytest_report.txt and report/lint_*.txt, constitute runtime evidence that the modular production package executes as described in Sections 5–8.</w:t>
       </w:r>
     </w:p>
     <w:p>
@@ -6639,7 +6639,7 @@
                 <w:color w:val="000000"/>
                 <w:sz w:val="18"/>
               </w:rPr>
-              <w:t>reports/</w:t>
+              <w:t>report/</w:t>
             </w:r>
           </w:p>
         </w:tc>

</xml_diff>

<commit_message>
Document evidence location: report/ folder in source package.
</commit_message>
<xml_diff>
--- a/report/179.docx
+++ b/report/179.docx
@@ -4474,6 +4474,20 @@
     </w:p>
     <w:p>
       <w:pPr>
+        <w:spacing w:after="160"/>
+      </w:pPr>
+      <w:r>
+        <w:rPr>
+          <w:rFonts w:ascii="Calibri" w:hAnsi="Calibri" w:eastAsia="Calibri"/>
+          <w:b w:val="0"/>
+          <w:i w:val="0"/>
+          <w:sz w:val="22"/>
+        </w:rPr>
+        <w:t>Evidence location (source package). Automated test output, lint before/after results, and the model/data metrics snapshot are included in the attached source zip (or Git repository) under the report/ folder, alongside this document. Key files: report/pytest_report.txt, report/lint_before.txt, report/lint_after.txt, and report/metrics_snapshot.json. Application screenshots are embedded in this report and also stored under Screenshots/ in the source package.</w:t>
+      </w:r>
+    </w:p>
+    <w:p>
+      <w:pPr>
         <w:pStyle w:val="Heading1"/>
         <w:keepNext/>
       </w:pPr>
@@ -6208,7 +6222,7 @@
           <w:i w:val="0"/>
           <w:sz w:val="22"/>
         </w:rPr>
-        <w:t>Application screenshots used in this report are stored under Screenshots/ (Streamlit UI and FastAPI /docs execution evidence).</w:t>
+        <w:t>Evidence location. Full source code, automated tests (tests/), and quality evidence live in the attached source zip / Git package. The report/ folder holds this Word/PDF narrative together with pytest, lint, and metrics artifacts (pytest_report.txt, lint_before.txt, lint_after.txt, metrics_snapshot.json). UI and API screenshots used above are under Screenshots/ in the same package.</w:t>
       </w:r>
     </w:p>
     <w:tbl>
@@ -6435,16 +6449,8 @@
             <w:vAlign w:val="center"/>
           </w:tcPr>
           <w:p>
-            <w:pPr>
-              <w:spacing w:before="0" w:after="0" w:line="240" w:lineRule="auto"/>
-            </w:pPr>
             <w:r>
-              <w:rPr>
-                <w:rFonts w:ascii="Calibri" w:hAnsi="Calibri"/>
-                <w:color w:val="000000"/>
-                <w:sz w:val="18"/>
-              </w:rPr>
-              <w:t>Submission report</w:t>
+              <w:t>Submission report (this document); evidence paths described in Appendix</w:t>
             </w:r>
           </w:p>
         </w:tc>
@@ -6655,16 +6661,8 @@
             <w:vAlign w:val="center"/>
           </w:tcPr>
           <w:p>
-            <w:pPr>
-              <w:spacing w:before="0" w:after="0" w:line="240" w:lineRule="auto"/>
-            </w:pPr>
             <w:r>
-              <w:rPr>
-                <w:rFonts w:ascii="Calibri" w:hAnsi="Calibri"/>
-                <w:color w:val="000000"/>
-                <w:sz w:val="18"/>
-              </w:rPr>
-              <w:t>Pytest, lint, and metric evidence</w:t>
+              <w:t>Taxila report plus pytest, lint, and metrics snapshot in the source zip</w:t>
             </w:r>
           </w:p>
         </w:tc>
@@ -7219,6 +7217,28 @@
           </w:p>
         </w:tc>
       </w:tr>
+      <w:tr>
+        <w:tc>
+          <w:tcPr>
+            <w:tcW w:type="dxa" w:w="4100"/>
+          </w:tcPr>
+          <w:p>
+            <w:r>
+              <w:t>QA evidence path</w:t>
+            </w:r>
+          </w:p>
+        </w:tc>
+        <w:tc>
+          <w:tcPr>
+            <w:tcW w:type="dxa" w:w="5260"/>
+          </w:tcPr>
+          <w:p>
+            <w:r>
+              <w:t>report/ in source zip (pytest, lint, metrics); Screenshots/ for UI/API</w:t>
+            </w:r>
+          </w:p>
+        </w:tc>
+      </w:tr>
     </w:tbl>
     <w:p>
       <w:pPr>

</xml_diff>

<commit_message>
Update group contribution table with qualitative tasks and percentages.
</commit_message>
<xml_diff>
--- a/report/179.docx
+++ b/report/179.docx
@@ -92,16 +92,7 @@
             <w:vAlign w:val="center"/>
           </w:tcPr>
           <w:p>
-            <w:pPr>
-              <w:spacing w:before="0" w:after="0" w:line="240" w:lineRule="auto"/>
-            </w:pPr>
             <w:r>
-              <w:rPr>
-                <w:rFonts w:ascii="Calibri" w:hAnsi="Calibri"/>
-                <w:b/>
-                <w:color w:val="0B2545"/>
-                <w:sz w:val="19"/>
-              </w:rPr>
               <w:t>BITS ID</w:t>
             </w:r>
           </w:p>
@@ -119,16 +110,7 @@
             <w:vAlign w:val="center"/>
           </w:tcPr>
           <w:p>
-            <w:pPr>
-              <w:spacing w:before="0" w:after="0" w:line="240" w:lineRule="auto"/>
-            </w:pPr>
             <w:r>
-              <w:rPr>
-                <w:rFonts w:ascii="Calibri" w:hAnsi="Calibri"/>
-                <w:b/>
-                <w:color w:val="0B2545"/>
-                <w:sz w:val="19"/>
-              </w:rPr>
               <w:t>Name</w:t>
             </w:r>
           </w:p>
@@ -146,17 +128,8 @@
             <w:vAlign w:val="center"/>
           </w:tcPr>
           <w:p>
-            <w:pPr>
-              <w:spacing w:before="0" w:after="0" w:line="240" w:lineRule="auto"/>
-            </w:pPr>
             <w:r>
-              <w:rPr>
-                <w:rFonts w:ascii="Calibri" w:hAnsi="Calibri"/>
-                <w:b/>
-                <w:color w:val="0B2545"/>
-                <w:sz w:val="19"/>
-              </w:rPr>
-              <w:t>Contribution</w:t>
+              <w:t>Qualitative Task Description</w:t>
             </w:r>
           </w:p>
         </w:tc>
@@ -173,16 +146,7 @@
             <w:vAlign w:val="center"/>
           </w:tcPr>
           <w:p>
-            <w:pPr>
-              <w:spacing w:before="0" w:after="0" w:line="240" w:lineRule="auto"/>
-            </w:pPr>
             <w:r>
-              <w:rPr>
-                <w:rFonts w:ascii="Calibri" w:hAnsi="Calibri"/>
-                <w:b/>
-                <w:color w:val="0B2545"/>
-                <w:sz w:val="19"/>
-              </w:rPr>
               <w:t>Percentage</w:t>
             </w:r>
           </w:p>
@@ -204,15 +168,7 @@
             <w:vAlign w:val="center"/>
           </w:tcPr>
           <w:p>
-            <w:pPr>
-              <w:spacing w:before="0" w:after="0" w:line="240" w:lineRule="auto"/>
-            </w:pPr>
             <w:r>
-              <w:rPr>
-                <w:rFonts w:ascii="Calibri" w:hAnsi="Calibri"/>
-                <w:color w:val="000000"/>
-                <w:sz w:val="18"/>
-              </w:rPr>
               <w:t>2025AB05113</w:t>
             </w:r>
           </w:p>
@@ -229,15 +185,7 @@
             <w:vAlign w:val="center"/>
           </w:tcPr>
           <w:p>
-            <w:pPr>
-              <w:spacing w:before="0" w:after="0" w:line="240" w:lineRule="auto"/>
-            </w:pPr>
             <w:r>
-              <w:rPr>
-                <w:rFonts w:ascii="Calibri" w:hAnsi="Calibri"/>
-                <w:color w:val="000000"/>
-                <w:sz w:val="18"/>
-              </w:rPr>
               <w:t>Prashant</w:t>
             </w:r>
           </w:p>
@@ -254,16 +202,8 @@
             <w:vAlign w:val="center"/>
           </w:tcPr>
           <w:p>
-            <w:pPr>
-              <w:spacing w:before="0" w:after="0" w:line="240" w:lineRule="auto"/>
-            </w:pPr>
             <w:r>
-              <w:rPr>
-                <w:rFonts w:ascii="Calibri" w:hAnsi="Calibri"/>
-                <w:color w:val="000000"/>
-                <w:sz w:val="18"/>
-              </w:rPr>
-              <w:t>ML implementation and API, Architecture and code quality</w:t>
+              <w:t>Implemented ML training &amp; preprocessing pipelines, built FastAPI REST endpoints, authored automated Pytest suite, and drafted initial report sections.</w:t>
             </w:r>
           </w:p>
         </w:tc>
@@ -279,15 +219,8 @@
             <w:vAlign w:val="center"/>
           </w:tcPr>
           <w:p>
-            <w:pPr>
-              <w:spacing w:before="0" w:after="0" w:line="240" w:lineRule="auto"/>
-            </w:pPr>
             <w:r>
-              <w:rPr>
-                <w:rFonts w:ascii="Calibri" w:hAnsi="Calibri"/>
-                <w:color w:val="000000"/>
-                <w:sz w:val="18"/>
-              </w:rPr>
+              <w:t>25%</w:t>
             </w:r>
           </w:p>
         </w:tc>
@@ -308,15 +241,7 @@
             <w:vAlign w:val="center"/>
           </w:tcPr>
           <w:p>
-            <w:pPr>
-              <w:spacing w:before="0" w:after="0" w:line="240" w:lineRule="auto"/>
-            </w:pPr>
             <w:r>
-              <w:rPr>
-                <w:rFonts w:ascii="Calibri" w:hAnsi="Calibri"/>
-                <w:color w:val="000000"/>
-                <w:sz w:val="18"/>
-              </w:rPr>
               <w:t>2025AA05032</w:t>
             </w:r>
           </w:p>
@@ -333,15 +258,7 @@
             <w:vAlign w:val="center"/>
           </w:tcPr>
           <w:p>
-            <w:pPr>
-              <w:spacing w:before="0" w:after="0" w:line="240" w:lineRule="auto"/>
-            </w:pPr>
             <w:r>
-              <w:rPr>
-                <w:rFonts w:ascii="Calibri" w:hAnsi="Calibri"/>
-                <w:color w:val="000000"/>
-                <w:sz w:val="18"/>
-              </w:rPr>
               <w:t>Prathap Wagle</w:t>
             </w:r>
           </w:p>
@@ -358,16 +275,8 @@
             <w:vAlign w:val="center"/>
           </w:tcPr>
           <w:p>
-            <w:pPr>
-              <w:spacing w:before="0" w:after="0" w:line="240" w:lineRule="auto"/>
-            </w:pPr>
             <w:r>
-              <w:rPr>
-                <w:rFonts w:ascii="Calibri" w:hAnsi="Calibri"/>
-                <w:color w:val="000000"/>
-                <w:sz w:val="18"/>
-              </w:rPr>
-              <w:t>ML implementation and API, Architecture and code quality</w:t>
+              <w:t>Designed system architecture, integrated Streamlit UI &amp; application layer, authored main report, added code comments, and validated submission readiness.</w:t>
             </w:r>
           </w:p>
         </w:tc>
@@ -383,15 +292,8 @@
             <w:vAlign w:val="center"/>
           </w:tcPr>
           <w:p>
-            <w:pPr>
-              <w:spacing w:before="0" w:after="0" w:line="240" w:lineRule="auto"/>
-            </w:pPr>
             <w:r>
-              <w:rPr>
-                <w:rFonts w:ascii="Calibri" w:hAnsi="Calibri"/>
-                <w:color w:val="000000"/>
-                <w:sz w:val="18"/>
-              </w:rPr>
+              <w:t>25%</w:t>
             </w:r>
           </w:p>
         </w:tc>
@@ -412,15 +314,7 @@
             <w:vAlign w:val="center"/>
           </w:tcPr>
           <w:p>
-            <w:pPr>
-              <w:spacing w:before="0" w:after="0" w:line="240" w:lineRule="auto"/>
-            </w:pPr>
             <w:r>
-              <w:rPr>
-                <w:rFonts w:ascii="Calibri" w:hAnsi="Calibri"/>
-                <w:color w:val="000000"/>
-                <w:sz w:val="18"/>
-              </w:rPr>
               <w:t>2024AC05999</w:t>
             </w:r>
           </w:p>
@@ -437,15 +331,7 @@
             <w:vAlign w:val="center"/>
           </w:tcPr>
           <w:p>
-            <w:pPr>
-              <w:spacing w:before="0" w:after="0" w:line="240" w:lineRule="auto"/>
-            </w:pPr>
             <w:r>
-              <w:rPr>
-                <w:rFonts w:ascii="Calibri" w:hAnsi="Calibri"/>
-                <w:color w:val="000000"/>
-                <w:sz w:val="18"/>
-              </w:rPr>
               <w:t>Prasanna R T</w:t>
             </w:r>
           </w:p>
@@ -462,16 +348,8 @@
             <w:vAlign w:val="center"/>
           </w:tcPr>
           <w:p>
-            <w:pPr>
-              <w:spacing w:before="0" w:after="0" w:line="240" w:lineRule="auto"/>
-            </w:pPr>
             <w:r>
-              <w:rPr>
-                <w:rFonts w:ascii="Calibri" w:hAnsi="Calibri"/>
-                <w:color w:val="000000"/>
-                <w:sz w:val="18"/>
-              </w:rPr>
-              <w:t>Test design, execution and review</w:t>
+              <w:t>Conducted test design review, performed functional validation of candidate scoring workflows, and verified edge-case handling.</w:t>
             </w:r>
           </w:p>
         </w:tc>
@@ -487,15 +365,8 @@
             <w:vAlign w:val="center"/>
           </w:tcPr>
           <w:p>
-            <w:pPr>
-              <w:spacing w:before="0" w:after="0" w:line="240" w:lineRule="auto"/>
-            </w:pPr>
             <w:r>
-              <w:rPr>
-                <w:rFonts w:ascii="Calibri" w:hAnsi="Calibri"/>
-                <w:color w:val="000000"/>
-                <w:sz w:val="18"/>
-              </w:rPr>
+              <w:t>25%</w:t>
             </w:r>
           </w:p>
         </w:tc>
@@ -516,15 +387,7 @@
             <w:vAlign w:val="center"/>
           </w:tcPr>
           <w:p>
-            <w:pPr>
-              <w:spacing w:before="0" w:after="0" w:line="240" w:lineRule="auto"/>
-            </w:pPr>
             <w:r>
-              <w:rPr>
-                <w:rFonts w:ascii="Calibri" w:hAnsi="Calibri"/>
-                <w:color w:val="000000"/>
-                <w:sz w:val="18"/>
-              </w:rPr>
               <w:t>2024AC05914</w:t>
             </w:r>
           </w:p>
@@ -541,15 +404,7 @@
             <w:vAlign w:val="center"/>
           </w:tcPr>
           <w:p>
-            <w:pPr>
-              <w:spacing w:before="0" w:after="0" w:line="240" w:lineRule="auto"/>
-            </w:pPr>
             <w:r>
-              <w:rPr>
-                <w:rFonts w:ascii="Calibri" w:hAnsi="Calibri"/>
-                <w:color w:val="000000"/>
-                <w:sz w:val="18"/>
-              </w:rPr>
               <w:t>Pranav Mehrotra</w:t>
             </w:r>
           </w:p>
@@ -566,16 +421,8 @@
             <w:vAlign w:val="center"/>
           </w:tcPr>
           <w:p>
-            <w:pPr>
-              <w:spacing w:before="0" w:after="0" w:line="240" w:lineRule="auto"/>
-            </w:pPr>
             <w:r>
-              <w:rPr>
-                <w:rFonts w:ascii="Calibri" w:hAnsi="Calibri"/>
-                <w:color w:val="000000"/>
-                <w:sz w:val="18"/>
-              </w:rPr>
-              <w:t>QA evidence and final review</w:t>
+              <w:t>Reviewed quality assurance evidence, conducted code audit reviews, and validated final submission package integrity.</w:t>
             </w:r>
           </w:p>
         </w:tc>
@@ -591,15 +438,8 @@
             <w:vAlign w:val="center"/>
           </w:tcPr>
           <w:p>
-            <w:pPr>
-              <w:spacing w:before="0" w:after="0" w:line="240" w:lineRule="auto"/>
-            </w:pPr>
             <w:r>
-              <w:rPr>
-                <w:rFonts w:ascii="Calibri" w:hAnsi="Calibri"/>
-                <w:color w:val="000000"/>
-                <w:sz w:val="18"/>
-              </w:rPr>
+              <w:t>25%</w:t>
             </w:r>
           </w:p>
         </w:tc>

</xml_diff>

<commit_message>
Reorder report: application screenshots before conclusion.
</commit_message>
<xml_diff>
--- a/report/179.docx
+++ b/report/179.docx
@@ -5521,45 +5521,6 @@
     </w:p>
     <w:p>
       <w:pPr>
-        <w:pStyle w:val="Heading1"/>
-        <w:keepNext/>
-      </w:pPr>
-      <w:r>
-        <w:t>11. Conclusion</w:t>
-      </w:r>
-    </w:p>
-    <w:p>
-      <w:pPr>
-        <w:spacing w:before="0" w:after="120" w:line="264" w:lineRule="auto"/>
-      </w:pPr>
-      <w:r>
-        <w:rPr>
-          <w:rFonts w:ascii="Calibri" w:hAnsi="Calibri"/>
-        </w:rPr>
-        <w:t>The Assignment I prototype has been evolved into a feature-preserving, production-style ML system. The final package demonstrates explicit research-to-production separation, modular architecture, persistent artifacts, structured logging, robust validation, a typed REST API, multi-level automated testing, quality gates, privacy-aware audit history, and production experimentation planning.</w:t>
-      </w:r>
-    </w:p>
-    <w:p>
-      <w:r>
-        <w:br w:type="page"/>
-      </w:r>
-    </w:p>
-    <w:p>
-      <w:pPr>
-        <w:pStyle w:val="Heading1"/>
-      </w:pPr>
-      <w:r>
-        <w:rPr>
-          <w:rFonts w:ascii="Calibri" w:hAnsi="Calibri" w:eastAsia="Calibri"/>
-          <w:b/>
-          <w:i w:val="0"/>
-          <w:sz w:val="32"/>
-        </w:rPr>
-        <w:t>Application screenshots</w:t>
-      </w:r>
-    </w:p>
-    <w:p>
-      <w:pPr>
         <w:spacing w:after="160"/>
       </w:pPr>
       <w:r>
@@ -5569,35 +5530,23 @@
           <w:i w:val="0"/>
           <w:sz w:val="22"/>
         </w:rPr>
-        <w:t>The following screenshots demonstrate the running Assignment II system: the preserved recruiter UI (Streamlit) and the production-style FastAPI inference interface required by the assignment submission guidelines.</w:t>
+        <w:t>These screenshots, together with report/pytest_report.txt and report/lint_*.txt, constitute runtime evidence that the modular production package executes as described in Sections 5–8.</w:t>
       </w:r>
     </w:p>
     <w:p>
       <w:pPr>
-        <w:pStyle w:val="Heading2"/>
-      </w:pPr>
-      <w:r>
-        <w:rPr>
-          <w:rFonts w:ascii="Calibri" w:hAnsi="Calibri" w:eastAsia="Calibri"/>
-          <w:b/>
-          <w:i w:val="0"/>
-          <w:sz w:val="26"/>
-        </w:rPr>
-        <w:t>A. Recruiter application (Streamlit)</w:t>
-      </w:r>
-    </w:p>
-    <w:p>
-      <w:pPr>
-        <w:spacing w:after="160"/>
+        <w:spacing w:before="80" w:after="240"/>
+        <w:jc w:val="center"/>
       </w:pPr>
       <w:r>
         <w:rPr>
           <w:rFonts w:ascii="Calibri" w:hAnsi="Calibri" w:eastAsia="Calibri"/>
           <w:b w:val="0"/>
-          <w:i w:val="0"/>
-          <w:sz w:val="22"/>
+          <w:i/>
+          <w:color w:val="333333"/>
+          <w:sz w:val="20"/>
         </w:rPr>
-        <w:t>The Streamlit app preserves the Assignment I workflow (candidate name, TXT/PDF/DOCX upload or paste, analysis, explanation, and audit history) while routing scoring through the shared modular ResumeScreeningApplication service.</w:t>
+        <w:t>Figure 8. GET /metrics — persisted model and data quality snapshot used for release evidence and UI sidebar metrics.</w:t>
       </w:r>
     </w:p>
     <w:p>
@@ -5608,8 +5557,8 @@
       <w:r>
         <w:drawing>
           <wp:inline xmlns:a="http://schemas.openxmlformats.org/drawingml/2006/main" xmlns:pic="http://schemas.openxmlformats.org/drawingml/2006/picture">
-            <wp:extent cx="5760720" cy="3102619"/>
-            <wp:docPr id="2" name="Picture 2"/>
+            <wp:extent cx="5760720" cy="3118745"/>
+            <wp:docPr id="8" name="Picture 8"/>
             <wp:cNvGraphicFramePr>
               <a:graphicFrameLocks noChangeAspect="1"/>
             </wp:cNvGraphicFramePr>
@@ -5617,11 +5566,11 @@
               <a:graphicData uri="http://schemas.openxmlformats.org/drawingml/2006/picture">
                 <pic:pic>
                   <pic:nvPicPr>
-                    <pic:cNvPr id="0" name="MainApp.png"/>
+                    <pic:cNvPr id="0" name="API_PredictionMetrics.png"/>
                     <pic:cNvPicPr/>
                   </pic:nvPicPr>
                   <pic:blipFill>
-                    <a:blip r:embed="rId12"/>
+                    <a:blip r:embed="rId18"/>
                     <a:stretch>
                       <a:fillRect/>
                     </a:stretch>
@@ -5629,7 +5578,7 @@
                   <pic:spPr>
                     <a:xfrm>
                       <a:off x="0" y="0"/>
-                      <a:ext cx="5760720" cy="3102619"/>
+                      <a:ext cx="5760720" cy="3118745"/>
                     </a:xfrm>
                     <a:prstGeom prst="rect"/>
                   </pic:spPr>
@@ -5653,7 +5602,259 @@
           <w:color w:val="333333"/>
           <w:sz w:val="20"/>
         </w:rPr>
-        <w:t>Figure 2. Main recruiter UI — upload/paste controls, verified model quality sidebar, and privacy-aware audit history (no raw resume text stored).</w:t>
+        <w:t>Figure 7. POST /v1/predictions — successful 200 response with predicted_role, confidence, role_ranking, explanation, and decision_note.</w:t>
+      </w:r>
+    </w:p>
+    <w:p>
+      <w:pPr>
+        <w:spacing w:before="120" w:after="40"/>
+        <w:jc w:val="center"/>
+      </w:pPr>
+      <w:r>
+        <w:drawing>
+          <wp:inline xmlns:a="http://schemas.openxmlformats.org/drawingml/2006/main" xmlns:pic="http://schemas.openxmlformats.org/drawingml/2006/picture">
+            <wp:extent cx="5760720" cy="3081594"/>
+            <wp:docPr id="7" name="Picture 7"/>
+            <wp:cNvGraphicFramePr>
+              <a:graphicFrameLocks noChangeAspect="1"/>
+            </wp:cNvGraphicFramePr>
+            <a:graphic>
+              <a:graphicData uri="http://schemas.openxmlformats.org/drawingml/2006/picture">
+                <pic:pic>
+                  <pic:nvPicPr>
+                    <pic:cNvPr id="0" name="APIExecution_Predict_2.png"/>
+                    <pic:cNvPicPr/>
+                  </pic:nvPicPr>
+                  <pic:blipFill>
+                    <a:blip r:embed="rId17"/>
+                    <a:stretch>
+                      <a:fillRect/>
+                    </a:stretch>
+                  </pic:blipFill>
+                  <pic:spPr>
+                    <a:xfrm>
+                      <a:off x="0" y="0"/>
+                      <a:ext cx="5760720" cy="3081594"/>
+                    </a:xfrm>
+                    <a:prstGeom prst="rect"/>
+                  </pic:spPr>
+                </pic:pic>
+              </a:graphicData>
+            </a:graphic>
+          </wp:inline>
+        </w:drawing>
+      </w:r>
+    </w:p>
+    <w:p>
+      <w:pPr>
+        <w:spacing w:before="80" w:after="240"/>
+        <w:jc w:val="center"/>
+      </w:pPr>
+      <w:r>
+        <w:rPr>
+          <w:rFonts w:ascii="Calibri" w:hAnsi="Calibri" w:eastAsia="Calibri"/>
+          <w:b w:val="0"/>
+          <w:i/>
+          <w:color w:val="333333"/>
+          <w:sz w:val="20"/>
+        </w:rPr>
+        <w:t>Figure 6. POST /v1/predictions — interactive request form (candidate_name, resume_text).</w:t>
+      </w:r>
+    </w:p>
+    <w:p>
+      <w:pPr>
+        <w:spacing w:before="120" w:after="40"/>
+        <w:jc w:val="center"/>
+      </w:pPr>
+      <w:r>
+        <w:drawing>
+          <wp:inline xmlns:a="http://schemas.openxmlformats.org/drawingml/2006/main" xmlns:pic="http://schemas.openxmlformats.org/drawingml/2006/picture">
+            <wp:extent cx="5760720" cy="3093608"/>
+            <wp:docPr id="6" name="Picture 6"/>
+            <wp:cNvGraphicFramePr>
+              <a:graphicFrameLocks noChangeAspect="1"/>
+            </wp:cNvGraphicFramePr>
+            <a:graphic>
+              <a:graphicData uri="http://schemas.openxmlformats.org/drawingml/2006/picture">
+                <pic:pic>
+                  <pic:nvPicPr>
+                    <pic:cNvPr id="0" name="APIExecution_Predict_1.png"/>
+                    <pic:cNvPicPr/>
+                  </pic:nvPicPr>
+                  <pic:blipFill>
+                    <a:blip r:embed="rId16"/>
+                    <a:stretch>
+                      <a:fillRect/>
+                    </a:stretch>
+                  </pic:blipFill>
+                  <pic:spPr>
+                    <a:xfrm>
+                      <a:off x="0" y="0"/>
+                      <a:ext cx="5760720" cy="3093608"/>
+                    </a:xfrm>
+                    <a:prstGeom prst="rect"/>
+                  </pic:spPr>
+                </pic:pic>
+              </a:graphicData>
+            </a:graphic>
+          </wp:inline>
+        </w:drawing>
+      </w:r>
+    </w:p>
+    <w:p>
+      <w:pPr>
+        <w:spacing w:before="80" w:after="240"/>
+        <w:jc w:val="center"/>
+      </w:pPr>
+      <w:r>
+        <w:rPr>
+          <w:rFonts w:ascii="Calibri" w:hAnsi="Calibri" w:eastAsia="Calibri"/>
+          <w:b w:val="0"/>
+          <w:i/>
+          <w:color w:val="333333"/>
+          <w:sz w:val="20"/>
+        </w:rPr>
+        <w:t>Figure 5. GET /health — service ready with model_loaded=true and API version 2.1.0.</w:t>
+      </w:r>
+    </w:p>
+    <w:p>
+      <w:pPr>
+        <w:spacing w:before="120" w:after="40"/>
+        <w:jc w:val="center"/>
+      </w:pPr>
+      <w:r>
+        <w:drawing>
+          <wp:inline xmlns:a="http://schemas.openxmlformats.org/drawingml/2006/main" xmlns:pic="http://schemas.openxmlformats.org/drawingml/2006/picture">
+            <wp:extent cx="5486400" cy="1133699"/>
+            <wp:docPr id="5" name="Picture 5"/>
+            <wp:cNvGraphicFramePr>
+              <a:graphicFrameLocks noChangeAspect="1"/>
+            </wp:cNvGraphicFramePr>
+            <a:graphic>
+              <a:graphicData uri="http://schemas.openxmlformats.org/drawingml/2006/picture">
+                <pic:pic>
+                  <pic:nvPicPr>
+                    <pic:cNvPr id="0" name="FastHeatlthCheck.png"/>
+                    <pic:cNvPicPr/>
+                  </pic:nvPicPr>
+                  <pic:blipFill>
+                    <a:blip r:embed="rId15"/>
+                    <a:stretch>
+                      <a:fillRect/>
+                    </a:stretch>
+                  </pic:blipFill>
+                  <pic:spPr>
+                    <a:xfrm>
+                      <a:off x="0" y="0"/>
+                      <a:ext cx="5486400" cy="1133699"/>
+                    </a:xfrm>
+                    <a:prstGeom prst="rect"/>
+                  </pic:spPr>
+                </pic:pic>
+              </a:graphicData>
+            </a:graphic>
+          </wp:inline>
+        </w:drawing>
+      </w:r>
+    </w:p>
+    <w:p>
+      <w:pPr>
+        <w:spacing w:before="80" w:after="240"/>
+        <w:jc w:val="center"/>
+      </w:pPr>
+      <w:r>
+        <w:rPr>
+          <w:rFonts w:ascii="Calibri" w:hAnsi="Calibri" w:eastAsia="Calibri"/>
+          <w:b w:val="0"/>
+          <w:i/>
+          <w:color w:val="333333"/>
+          <w:sz w:val="20"/>
+        </w:rPr>
+        <w:t>Figure 4. OpenAPI specification — GET /health, POST /v1/predictions, POST /predict, GET /metrics, and generated schema models.</w:t>
+      </w:r>
+    </w:p>
+    <w:p>
+      <w:pPr>
+        <w:spacing w:before="120" w:after="40"/>
+        <w:jc w:val="center"/>
+      </w:pPr>
+      <w:r>
+        <w:drawing>
+          <wp:inline xmlns:a="http://schemas.openxmlformats.org/drawingml/2006/main" xmlns:pic="http://schemas.openxmlformats.org/drawingml/2006/picture">
+            <wp:extent cx="5760720" cy="3084598"/>
+            <wp:docPr id="4" name="Picture 4"/>
+            <wp:cNvGraphicFramePr>
+              <a:graphicFrameLocks noChangeAspect="1"/>
+            </wp:cNvGraphicFramePr>
+            <a:graphic>
+              <a:graphicData uri="http://schemas.openxmlformats.org/drawingml/2006/picture">
+                <pic:pic>
+                  <pic:nvPicPr>
+                    <pic:cNvPr id="0" name="APISpec.png"/>
+                    <pic:cNvPicPr/>
+                  </pic:nvPicPr>
+                  <pic:blipFill>
+                    <a:blip r:embed="rId14"/>
+                    <a:stretch>
+                      <a:fillRect/>
+                    </a:stretch>
+                  </pic:blipFill>
+                  <pic:spPr>
+                    <a:xfrm>
+                      <a:off x="0" y="0"/>
+                      <a:ext cx="5760720" cy="3084598"/>
+                    </a:xfrm>
+                    <a:prstGeom prst="rect"/>
+                  </pic:spPr>
+                </pic:pic>
+              </a:graphicData>
+            </a:graphic>
+          </wp:inline>
+        </w:drawing>
+      </w:r>
+    </w:p>
+    <w:p>
+      <w:pPr>
+        <w:spacing w:after="160"/>
+      </w:pPr>
+      <w:r>
+        <w:rPr>
+          <w:rFonts w:ascii="Calibri" w:hAnsi="Calibri" w:eastAsia="Calibri"/>
+          <w:b w:val="0"/>
+          <w:i w:val="0"/>
+          <w:sz w:val="22"/>
+        </w:rPr>
+        <w:t>The FastAPI service exposes typed health, prediction, and metrics endpoints with OpenAPI documentation at /docs. Request and response schemas are defined in app/schemas.py; inference uses the same application service as Streamlit.</w:t>
+      </w:r>
+    </w:p>
+    <w:p>
+      <w:pPr>
+        <w:pStyle w:val="Heading2"/>
+      </w:pPr>
+      <w:r>
+        <w:rPr>
+          <w:rFonts w:ascii="Calibri" w:hAnsi="Calibri" w:eastAsia="Calibri"/>
+          <w:b/>
+          <w:i w:val="0"/>
+          <w:sz w:val="26"/>
+        </w:rPr>
+        <w:t>B. REST API (FastAPI / OpenAPI)</w:t>
+      </w:r>
+    </w:p>
+    <w:p>
+      <w:pPr>
+        <w:spacing w:before="80" w:after="240"/>
+        <w:jc w:val="center"/>
+      </w:pPr>
+      <w:r>
+        <w:rPr>
+          <w:rFonts w:ascii="Calibri" w:hAnsi="Calibri" w:eastAsia="Calibri"/>
+          <w:b w:val="0"/>
+          <w:i/>
+          <w:color w:val="333333"/>
+          <w:sz w:val="20"/>
+        </w:rPr>
+        <w:t>Figure 3. Sample resume analysis — predicted role, confidence, keyword explanation, advisory decision note, and role ranking table.</w:t>
       </w:r>
     </w:p>
     <w:p>
@@ -5709,7 +5910,61 @@
           <w:color w:val="333333"/>
           <w:sz w:val="20"/>
         </w:rPr>
-        <w:t>Figure 3. Sample resume analysis — predicted role, confidence, keyword explanation, advisory decision note, and role ranking table.</w:t>
+        <w:t>Figure 2. Main recruiter UI — upload/paste controls, verified model quality sidebar, and privacy-aware audit history (no raw resume text stored).</w:t>
+      </w:r>
+    </w:p>
+    <w:p>
+      <w:pPr>
+        <w:spacing w:before="120" w:after="40"/>
+        <w:jc w:val="center"/>
+      </w:pPr>
+      <w:r>
+        <w:drawing>
+          <wp:inline xmlns:a="http://schemas.openxmlformats.org/drawingml/2006/main" xmlns:pic="http://schemas.openxmlformats.org/drawingml/2006/picture">
+            <wp:extent cx="5760720" cy="3102619"/>
+            <wp:docPr id="2" name="Picture 2"/>
+            <wp:cNvGraphicFramePr>
+              <a:graphicFrameLocks noChangeAspect="1"/>
+            </wp:cNvGraphicFramePr>
+            <a:graphic>
+              <a:graphicData uri="http://schemas.openxmlformats.org/drawingml/2006/picture">
+                <pic:pic>
+                  <pic:nvPicPr>
+                    <pic:cNvPr id="0" name="MainApp.png"/>
+                    <pic:cNvPicPr/>
+                  </pic:nvPicPr>
+                  <pic:blipFill>
+                    <a:blip r:embed="rId12"/>
+                    <a:stretch>
+                      <a:fillRect/>
+                    </a:stretch>
+                  </pic:blipFill>
+                  <pic:spPr>
+                    <a:xfrm>
+                      <a:off x="0" y="0"/>
+                      <a:ext cx="5760720" cy="3102619"/>
+                    </a:xfrm>
+                    <a:prstGeom prst="rect"/>
+                  </pic:spPr>
+                </pic:pic>
+              </a:graphicData>
+            </a:graphic>
+          </wp:inline>
+        </w:drawing>
+      </w:r>
+    </w:p>
+    <w:p>
+      <w:pPr>
+        <w:spacing w:after="160"/>
+      </w:pPr>
+      <w:r>
+        <w:rPr>
+          <w:rFonts w:ascii="Calibri" w:hAnsi="Calibri" w:eastAsia="Calibri"/>
+          <w:b w:val="0"/>
+          <w:i w:val="0"/>
+          <w:sz w:val="22"/>
+        </w:rPr>
+        <w:t>The Streamlit app preserves the Assignment I workflow (candidate name, TXT/PDF/DOCX upload or paste, analysis, explanation, and audit history) while routing scoring through the shared modular ResumeScreeningApplication service.</w:t>
       </w:r>
     </w:p>
     <w:p>
@@ -5723,7 +5978,7 @@
           <w:i w:val="0"/>
           <w:sz w:val="26"/>
         </w:rPr>
-        <w:t>B. REST API (FastAPI / OpenAPI)</w:t>
+        <w:t>A. Recruiter application (Streamlit)</w:t>
       </w:r>
     </w:p>
     <w:p>
@@ -5737,301 +5992,46 @@
           <w:i w:val="0"/>
           <w:sz w:val="22"/>
         </w:rPr>
-        <w:t>The FastAPI service exposes typed health, prediction, and metrics endpoints with OpenAPI documentation at /docs. Request and response schemas are defined in app/schemas.py; inference uses the same application service as Streamlit.</w:t>
+        <w:t>The following screenshots demonstrate the running Assignment II system: the preserved recruiter UI (Streamlit) and the production-style FastAPI inference interface required by the assignment submission guidelines.</w:t>
       </w:r>
     </w:p>
     <w:p>
       <w:pPr>
-        <w:spacing w:before="120" w:after="40"/>
-        <w:jc w:val="center"/>
+        <w:pStyle w:val="Heading1"/>
       </w:pPr>
       <w:r>
-        <w:drawing>
-          <wp:inline xmlns:a="http://schemas.openxmlformats.org/drawingml/2006/main" xmlns:pic="http://schemas.openxmlformats.org/drawingml/2006/picture">
-            <wp:extent cx="5760720" cy="3084598"/>
-            <wp:docPr id="4" name="Picture 4"/>
-            <wp:cNvGraphicFramePr>
-              <a:graphicFrameLocks noChangeAspect="1"/>
-            </wp:cNvGraphicFramePr>
-            <a:graphic>
-              <a:graphicData uri="http://schemas.openxmlformats.org/drawingml/2006/picture">
-                <pic:pic>
-                  <pic:nvPicPr>
-                    <pic:cNvPr id="0" name="APISpec.png"/>
-                    <pic:cNvPicPr/>
-                  </pic:nvPicPr>
-                  <pic:blipFill>
-                    <a:blip r:embed="rId14"/>
-                    <a:stretch>
-                      <a:fillRect/>
-                    </a:stretch>
-                  </pic:blipFill>
-                  <pic:spPr>
-                    <a:xfrm>
-                      <a:off x="0" y="0"/>
-                      <a:ext cx="5760720" cy="3084598"/>
-                    </a:xfrm>
-                    <a:prstGeom prst="rect"/>
-                  </pic:spPr>
-                </pic:pic>
-              </a:graphicData>
-            </a:graphic>
-          </wp:inline>
-        </w:drawing>
+        <w:rPr>
+          <w:rFonts w:ascii="Calibri" w:hAnsi="Calibri" w:eastAsia="Calibri"/>
+          <w:b/>
+          <w:i w:val="0"/>
+          <w:sz w:val="32"/>
+        </w:rPr>
+        <w:t>Application screenshots</w:t>
+      </w:r>
+    </w:p>
+    <w:p>
+      <w:r>
+        <w:br w:type="page"/>
       </w:r>
     </w:p>
     <w:p>
       <w:pPr>
-        <w:spacing w:before="80" w:after="240"/>
-        <w:jc w:val="center"/>
+        <w:spacing w:before="0" w:after="120" w:line="264" w:lineRule="auto"/>
       </w:pPr>
       <w:r>
         <w:rPr>
-          <w:rFonts w:ascii="Calibri" w:hAnsi="Calibri" w:eastAsia="Calibri"/>
-          <w:b w:val="0"/>
-          <w:i/>
-          <w:color w:val="333333"/>
-          <w:sz w:val="20"/>
+          <w:rFonts w:ascii="Calibri" w:hAnsi="Calibri"/>
         </w:rPr>
-        <w:t>Figure 4. OpenAPI specification — GET /health, POST /v1/predictions, POST /predict, GET /metrics, and generated schema models.</w:t>
+        <w:t>The Assignment I prototype has been evolved into a feature-preserving, production-style ML system. The final package demonstrates explicit research-to-production separation, modular architecture, persistent artifacts, structured logging, robust validation, a typed REST API, multi-level automated testing, quality gates, privacy-aware audit history, and production experimentation planning.</w:t>
       </w:r>
     </w:p>
     <w:p>
       <w:pPr>
-        <w:spacing w:before="120" w:after="40"/>
-        <w:jc w:val="center"/>
+        <w:pStyle w:val="Heading1"/>
+        <w:keepNext/>
       </w:pPr>
       <w:r>
-        <w:drawing>
-          <wp:inline xmlns:a="http://schemas.openxmlformats.org/drawingml/2006/main" xmlns:pic="http://schemas.openxmlformats.org/drawingml/2006/picture">
-            <wp:extent cx="5486400" cy="1133699"/>
-            <wp:docPr id="5" name="Picture 5"/>
-            <wp:cNvGraphicFramePr>
-              <a:graphicFrameLocks noChangeAspect="1"/>
-            </wp:cNvGraphicFramePr>
-            <a:graphic>
-              <a:graphicData uri="http://schemas.openxmlformats.org/drawingml/2006/picture">
-                <pic:pic>
-                  <pic:nvPicPr>
-                    <pic:cNvPr id="0" name="FastHeatlthCheck.png"/>
-                    <pic:cNvPicPr/>
-                  </pic:nvPicPr>
-                  <pic:blipFill>
-                    <a:blip r:embed="rId15"/>
-                    <a:stretch>
-                      <a:fillRect/>
-                    </a:stretch>
-                  </pic:blipFill>
-                  <pic:spPr>
-                    <a:xfrm>
-                      <a:off x="0" y="0"/>
-                      <a:ext cx="5486400" cy="1133699"/>
-                    </a:xfrm>
-                    <a:prstGeom prst="rect"/>
-                  </pic:spPr>
-                </pic:pic>
-              </a:graphicData>
-            </a:graphic>
-          </wp:inline>
-        </w:drawing>
-      </w:r>
-    </w:p>
-    <w:p>
-      <w:pPr>
-        <w:spacing w:before="80" w:after="240"/>
-        <w:jc w:val="center"/>
-      </w:pPr>
-      <w:r>
-        <w:rPr>
-          <w:rFonts w:ascii="Calibri" w:hAnsi="Calibri" w:eastAsia="Calibri"/>
-          <w:b w:val="0"/>
-          <w:i/>
-          <w:color w:val="333333"/>
-          <w:sz w:val="20"/>
-        </w:rPr>
-        <w:t>Figure 5. GET /health — service ready with model_loaded=true and API version 2.1.0.</w:t>
-      </w:r>
-    </w:p>
-    <w:p>
-      <w:pPr>
-        <w:spacing w:before="120" w:after="40"/>
-        <w:jc w:val="center"/>
-      </w:pPr>
-      <w:r>
-        <w:drawing>
-          <wp:inline xmlns:a="http://schemas.openxmlformats.org/drawingml/2006/main" xmlns:pic="http://schemas.openxmlformats.org/drawingml/2006/picture">
-            <wp:extent cx="5760720" cy="3093608"/>
-            <wp:docPr id="6" name="Picture 6"/>
-            <wp:cNvGraphicFramePr>
-              <a:graphicFrameLocks noChangeAspect="1"/>
-            </wp:cNvGraphicFramePr>
-            <a:graphic>
-              <a:graphicData uri="http://schemas.openxmlformats.org/drawingml/2006/picture">
-                <pic:pic>
-                  <pic:nvPicPr>
-                    <pic:cNvPr id="0" name="APIExecution_Predict_1.png"/>
-                    <pic:cNvPicPr/>
-                  </pic:nvPicPr>
-                  <pic:blipFill>
-                    <a:blip r:embed="rId16"/>
-                    <a:stretch>
-                      <a:fillRect/>
-                    </a:stretch>
-                  </pic:blipFill>
-                  <pic:spPr>
-                    <a:xfrm>
-                      <a:off x="0" y="0"/>
-                      <a:ext cx="5760720" cy="3093608"/>
-                    </a:xfrm>
-                    <a:prstGeom prst="rect"/>
-                  </pic:spPr>
-                </pic:pic>
-              </a:graphicData>
-            </a:graphic>
-          </wp:inline>
-        </w:drawing>
-      </w:r>
-    </w:p>
-    <w:p>
-      <w:pPr>
-        <w:spacing w:before="80" w:after="240"/>
-        <w:jc w:val="center"/>
-      </w:pPr>
-      <w:r>
-        <w:rPr>
-          <w:rFonts w:ascii="Calibri" w:hAnsi="Calibri" w:eastAsia="Calibri"/>
-          <w:b w:val="0"/>
-          <w:i/>
-          <w:color w:val="333333"/>
-          <w:sz w:val="20"/>
-        </w:rPr>
-        <w:t>Figure 6. POST /v1/predictions — interactive request form (candidate_name, resume_text).</w:t>
-      </w:r>
-    </w:p>
-    <w:p>
-      <w:pPr>
-        <w:spacing w:before="120" w:after="40"/>
-        <w:jc w:val="center"/>
-      </w:pPr>
-      <w:r>
-        <w:drawing>
-          <wp:inline xmlns:a="http://schemas.openxmlformats.org/drawingml/2006/main" xmlns:pic="http://schemas.openxmlformats.org/drawingml/2006/picture">
-            <wp:extent cx="5760720" cy="3081594"/>
-            <wp:docPr id="7" name="Picture 7"/>
-            <wp:cNvGraphicFramePr>
-              <a:graphicFrameLocks noChangeAspect="1"/>
-            </wp:cNvGraphicFramePr>
-            <a:graphic>
-              <a:graphicData uri="http://schemas.openxmlformats.org/drawingml/2006/picture">
-                <pic:pic>
-                  <pic:nvPicPr>
-                    <pic:cNvPr id="0" name="APIExecution_Predict_2.png"/>
-                    <pic:cNvPicPr/>
-                  </pic:nvPicPr>
-                  <pic:blipFill>
-                    <a:blip r:embed="rId17"/>
-                    <a:stretch>
-                      <a:fillRect/>
-                    </a:stretch>
-                  </pic:blipFill>
-                  <pic:spPr>
-                    <a:xfrm>
-                      <a:off x="0" y="0"/>
-                      <a:ext cx="5760720" cy="3081594"/>
-                    </a:xfrm>
-                    <a:prstGeom prst="rect"/>
-                  </pic:spPr>
-                </pic:pic>
-              </a:graphicData>
-            </a:graphic>
-          </wp:inline>
-        </w:drawing>
-      </w:r>
-    </w:p>
-    <w:p>
-      <w:pPr>
-        <w:spacing w:before="80" w:after="240"/>
-        <w:jc w:val="center"/>
-      </w:pPr>
-      <w:r>
-        <w:rPr>
-          <w:rFonts w:ascii="Calibri" w:hAnsi="Calibri" w:eastAsia="Calibri"/>
-          <w:b w:val="0"/>
-          <w:i/>
-          <w:color w:val="333333"/>
-          <w:sz w:val="20"/>
-        </w:rPr>
-        <w:t>Figure 7. POST /v1/predictions — successful 200 response with predicted_role, confidence, role_ranking, explanation, and decision_note.</w:t>
-      </w:r>
-    </w:p>
-    <w:p>
-      <w:pPr>
-        <w:spacing w:before="120" w:after="40"/>
-        <w:jc w:val="center"/>
-      </w:pPr>
-      <w:r>
-        <w:drawing>
-          <wp:inline xmlns:a="http://schemas.openxmlformats.org/drawingml/2006/main" xmlns:pic="http://schemas.openxmlformats.org/drawingml/2006/picture">
-            <wp:extent cx="5760720" cy="3118745"/>
-            <wp:docPr id="8" name="Picture 8"/>
-            <wp:cNvGraphicFramePr>
-              <a:graphicFrameLocks noChangeAspect="1"/>
-            </wp:cNvGraphicFramePr>
-            <a:graphic>
-              <a:graphicData uri="http://schemas.openxmlformats.org/drawingml/2006/picture">
-                <pic:pic>
-                  <pic:nvPicPr>
-                    <pic:cNvPr id="0" name="API_PredictionMetrics.png"/>
-                    <pic:cNvPicPr/>
-                  </pic:nvPicPr>
-                  <pic:blipFill>
-                    <a:blip r:embed="rId18"/>
-                    <a:stretch>
-                      <a:fillRect/>
-                    </a:stretch>
-                  </pic:blipFill>
-                  <pic:spPr>
-                    <a:xfrm>
-                      <a:off x="0" y="0"/>
-                      <a:ext cx="5760720" cy="3118745"/>
-                    </a:xfrm>
-                    <a:prstGeom prst="rect"/>
-                  </pic:spPr>
-                </pic:pic>
-              </a:graphicData>
-            </a:graphic>
-          </wp:inline>
-        </w:drawing>
-      </w:r>
-    </w:p>
-    <w:p>
-      <w:pPr>
-        <w:spacing w:before="80" w:after="240"/>
-        <w:jc w:val="center"/>
-      </w:pPr>
-      <w:r>
-        <w:rPr>
-          <w:rFonts w:ascii="Calibri" w:hAnsi="Calibri" w:eastAsia="Calibri"/>
-          <w:b w:val="0"/>
-          <w:i/>
-          <w:color w:val="333333"/>
-          <w:sz w:val="20"/>
-        </w:rPr>
-        <w:t>Figure 8. GET /metrics — persisted model and data quality snapshot used for release evidence and UI sidebar metrics.</w:t>
-      </w:r>
-    </w:p>
-    <w:p>
-      <w:pPr>
-        <w:spacing w:after="160"/>
-      </w:pPr>
-      <w:r>
-        <w:rPr>
-          <w:rFonts w:ascii="Calibri" w:hAnsi="Calibri" w:eastAsia="Calibri"/>
-          <w:b w:val="0"/>
-          <w:i w:val="0"/>
-          <w:sz w:val="22"/>
-        </w:rPr>
-        <w:t>These screenshots, together with report/pytest_report.txt and report/lint_*.txt, constitute runtime evidence that the modular production package executes as described in Sections 5–8.</w:t>
+        <w:t>11. Conclusion</w:t>
       </w:r>
     </w:p>
     <w:p>

</xml_diff>

<commit_message>
Fix inverted screenshot and conclusion order in report.
</commit_message>
<xml_diff>
--- a/report/179.docx
+++ b/report/179.docx
@@ -5521,6 +5521,20 @@
     </w:p>
     <w:p>
       <w:pPr>
+        <w:pStyle w:val="Heading1"/>
+      </w:pPr>
+      <w:r>
+        <w:rPr>
+          <w:rFonts w:ascii="Calibri" w:hAnsi="Calibri" w:eastAsia="Calibri"/>
+          <w:b/>
+          <w:i w:val="0"/>
+          <w:sz w:val="32"/>
+        </w:rPr>
+        <w:t>Application screenshots</w:t>
+      </w:r>
+    </w:p>
+    <w:p>
+      <w:pPr>
         <w:spacing w:after="160"/>
       </w:pPr>
       <w:r>
@@ -5530,7 +5544,75 @@
           <w:i w:val="0"/>
           <w:sz w:val="22"/>
         </w:rPr>
-        <w:t>These screenshots, together with report/pytest_report.txt and report/lint_*.txt, constitute runtime evidence that the modular production package executes as described in Sections 5–8.</w:t>
+        <w:t>The following screenshots demonstrate the running Assignment II system: the preserved recruiter UI (Streamlit) and the production-style FastAPI inference interface required by the assignment submission guidelines.</w:t>
+      </w:r>
+    </w:p>
+    <w:p>
+      <w:pPr>
+        <w:pStyle w:val="Heading2"/>
+      </w:pPr>
+      <w:r>
+        <w:rPr>
+          <w:rFonts w:ascii="Calibri" w:hAnsi="Calibri" w:eastAsia="Calibri"/>
+          <w:b/>
+          <w:i w:val="0"/>
+          <w:sz w:val="26"/>
+        </w:rPr>
+        <w:t>A. Recruiter application (Streamlit)</w:t>
+      </w:r>
+    </w:p>
+    <w:p>
+      <w:pPr>
+        <w:spacing w:after="160"/>
+      </w:pPr>
+      <w:r>
+        <w:rPr>
+          <w:rFonts w:ascii="Calibri" w:hAnsi="Calibri" w:eastAsia="Calibri"/>
+          <w:b w:val="0"/>
+          <w:i w:val="0"/>
+          <w:sz w:val="22"/>
+        </w:rPr>
+        <w:t>The Streamlit app preserves the Assignment I workflow (candidate name, TXT/PDF/DOCX upload or paste, analysis, explanation, and audit history) while routing scoring through the shared modular ResumeScreeningApplication service.</w:t>
+      </w:r>
+    </w:p>
+    <w:p>
+      <w:pPr>
+        <w:spacing w:before="120" w:after="40"/>
+        <w:jc w:val="center"/>
+      </w:pPr>
+      <w:r>
+        <w:drawing>
+          <wp:inline xmlns:a="http://schemas.openxmlformats.org/drawingml/2006/main" xmlns:pic="http://schemas.openxmlformats.org/drawingml/2006/picture">
+            <wp:extent cx="5760720" cy="3102619"/>
+            <wp:docPr id="2" name="Picture 2"/>
+            <wp:cNvGraphicFramePr>
+              <a:graphicFrameLocks noChangeAspect="1"/>
+            </wp:cNvGraphicFramePr>
+            <a:graphic>
+              <a:graphicData uri="http://schemas.openxmlformats.org/drawingml/2006/picture">
+                <pic:pic>
+                  <pic:nvPicPr>
+                    <pic:cNvPr id="0" name="MainApp.png"/>
+                    <pic:cNvPicPr/>
+                  </pic:nvPicPr>
+                  <pic:blipFill>
+                    <a:blip r:embed="rId12"/>
+                    <a:stretch>
+                      <a:fillRect/>
+                    </a:stretch>
+                  </pic:blipFill>
+                  <pic:spPr>
+                    <a:xfrm>
+                      <a:off x="0" y="0"/>
+                      <a:ext cx="5760720" cy="3102619"/>
+                    </a:xfrm>
+                    <a:prstGeom prst="rect"/>
+                  </pic:spPr>
+                </pic:pic>
+              </a:graphicData>
+            </a:graphic>
+          </wp:inline>
+        </w:drawing>
       </w:r>
     </w:p>
     <w:p>
@@ -5546,7 +5628,315 @@
           <w:color w:val="333333"/>
           <w:sz w:val="20"/>
         </w:rPr>
-        <w:t>Figure 8. GET /metrics — persisted model and data quality snapshot used for release evidence and UI sidebar metrics.</w:t>
+        <w:t>Figure 2. Main recruiter UI — upload/paste controls, verified model quality sidebar, and privacy-aware audit history (no raw resume text stored).</w:t>
+      </w:r>
+    </w:p>
+    <w:p>
+      <w:pPr>
+        <w:spacing w:before="120" w:after="40"/>
+        <w:jc w:val="center"/>
+      </w:pPr>
+      <w:r>
+        <w:drawing>
+          <wp:inline xmlns:a="http://schemas.openxmlformats.org/drawingml/2006/main" xmlns:pic="http://schemas.openxmlformats.org/drawingml/2006/picture">
+            <wp:extent cx="5760720" cy="3093608"/>
+            <wp:docPr id="3" name="Picture 3"/>
+            <wp:cNvGraphicFramePr>
+              <a:graphicFrameLocks noChangeAspect="1"/>
+            </wp:cNvGraphicFramePr>
+            <a:graphic>
+              <a:graphicData uri="http://schemas.openxmlformats.org/drawingml/2006/picture">
+                <pic:pic>
+                  <pic:nvPicPr>
+                    <pic:cNvPr id="0" name="AppSampleResume.png"/>
+                    <pic:cNvPicPr/>
+                  </pic:nvPicPr>
+                  <pic:blipFill>
+                    <a:blip r:embed="rId13"/>
+                    <a:stretch>
+                      <a:fillRect/>
+                    </a:stretch>
+                  </pic:blipFill>
+                  <pic:spPr>
+                    <a:xfrm>
+                      <a:off x="0" y="0"/>
+                      <a:ext cx="5760720" cy="3093608"/>
+                    </a:xfrm>
+                    <a:prstGeom prst="rect"/>
+                  </pic:spPr>
+                </pic:pic>
+              </a:graphicData>
+            </a:graphic>
+          </wp:inline>
+        </w:drawing>
+      </w:r>
+    </w:p>
+    <w:p>
+      <w:pPr>
+        <w:spacing w:before="80" w:after="240"/>
+        <w:jc w:val="center"/>
+      </w:pPr>
+      <w:r>
+        <w:rPr>
+          <w:rFonts w:ascii="Calibri" w:hAnsi="Calibri" w:eastAsia="Calibri"/>
+          <w:b w:val="0"/>
+          <w:i/>
+          <w:color w:val="333333"/>
+          <w:sz w:val="20"/>
+        </w:rPr>
+        <w:t>Figure 3. Sample resume analysis — predicted role, confidence, keyword explanation, advisory decision note, and role ranking table.</w:t>
+      </w:r>
+    </w:p>
+    <w:p>
+      <w:pPr>
+        <w:pStyle w:val="Heading2"/>
+      </w:pPr>
+      <w:r>
+        <w:rPr>
+          <w:rFonts w:ascii="Calibri" w:hAnsi="Calibri" w:eastAsia="Calibri"/>
+          <w:b/>
+          <w:i w:val="0"/>
+          <w:sz w:val="26"/>
+        </w:rPr>
+        <w:t>B. REST API (FastAPI / OpenAPI)</w:t>
+      </w:r>
+    </w:p>
+    <w:p>
+      <w:pPr>
+        <w:spacing w:after="160"/>
+      </w:pPr>
+      <w:r>
+        <w:rPr>
+          <w:rFonts w:ascii="Calibri" w:hAnsi="Calibri" w:eastAsia="Calibri"/>
+          <w:b w:val="0"/>
+          <w:i w:val="0"/>
+          <w:sz w:val="22"/>
+        </w:rPr>
+        <w:t>The FastAPI service exposes typed health, prediction, and metrics endpoints with OpenAPI documentation at /docs. Request and response schemas are defined in app/schemas.py; inference uses the same application service as Streamlit.</w:t>
+      </w:r>
+    </w:p>
+    <w:p>
+      <w:pPr>
+        <w:spacing w:before="120" w:after="40"/>
+        <w:jc w:val="center"/>
+      </w:pPr>
+      <w:r>
+        <w:drawing>
+          <wp:inline xmlns:a="http://schemas.openxmlformats.org/drawingml/2006/main" xmlns:pic="http://schemas.openxmlformats.org/drawingml/2006/picture">
+            <wp:extent cx="5760720" cy="3084598"/>
+            <wp:docPr id="4" name="Picture 4"/>
+            <wp:cNvGraphicFramePr>
+              <a:graphicFrameLocks noChangeAspect="1"/>
+            </wp:cNvGraphicFramePr>
+            <a:graphic>
+              <a:graphicData uri="http://schemas.openxmlformats.org/drawingml/2006/picture">
+                <pic:pic>
+                  <pic:nvPicPr>
+                    <pic:cNvPr id="0" name="APISpec.png"/>
+                    <pic:cNvPicPr/>
+                  </pic:nvPicPr>
+                  <pic:blipFill>
+                    <a:blip r:embed="rId14"/>
+                    <a:stretch>
+                      <a:fillRect/>
+                    </a:stretch>
+                  </pic:blipFill>
+                  <pic:spPr>
+                    <a:xfrm>
+                      <a:off x="0" y="0"/>
+                      <a:ext cx="5760720" cy="3084598"/>
+                    </a:xfrm>
+                    <a:prstGeom prst="rect"/>
+                  </pic:spPr>
+                </pic:pic>
+              </a:graphicData>
+            </a:graphic>
+          </wp:inline>
+        </w:drawing>
+      </w:r>
+    </w:p>
+    <w:p>
+      <w:pPr>
+        <w:spacing w:before="80" w:after="240"/>
+        <w:jc w:val="center"/>
+      </w:pPr>
+      <w:r>
+        <w:rPr>
+          <w:rFonts w:ascii="Calibri" w:hAnsi="Calibri" w:eastAsia="Calibri"/>
+          <w:b w:val="0"/>
+          <w:i/>
+          <w:color w:val="333333"/>
+          <w:sz w:val="20"/>
+        </w:rPr>
+        <w:t>Figure 4. OpenAPI specification — GET /health, POST /v1/predictions, POST /predict, GET /metrics, and generated schema models.</w:t>
+      </w:r>
+    </w:p>
+    <w:p>
+      <w:pPr>
+        <w:spacing w:before="120" w:after="40"/>
+        <w:jc w:val="center"/>
+      </w:pPr>
+      <w:r>
+        <w:drawing>
+          <wp:inline xmlns:a="http://schemas.openxmlformats.org/drawingml/2006/main" xmlns:pic="http://schemas.openxmlformats.org/drawingml/2006/picture">
+            <wp:extent cx="5486400" cy="1133699"/>
+            <wp:docPr id="5" name="Picture 5"/>
+            <wp:cNvGraphicFramePr>
+              <a:graphicFrameLocks noChangeAspect="1"/>
+            </wp:cNvGraphicFramePr>
+            <a:graphic>
+              <a:graphicData uri="http://schemas.openxmlformats.org/drawingml/2006/picture">
+                <pic:pic>
+                  <pic:nvPicPr>
+                    <pic:cNvPr id="0" name="FastHeatlthCheck.png"/>
+                    <pic:cNvPicPr/>
+                  </pic:nvPicPr>
+                  <pic:blipFill>
+                    <a:blip r:embed="rId15"/>
+                    <a:stretch>
+                      <a:fillRect/>
+                    </a:stretch>
+                  </pic:blipFill>
+                  <pic:spPr>
+                    <a:xfrm>
+                      <a:off x="0" y="0"/>
+                      <a:ext cx="5486400" cy="1133699"/>
+                    </a:xfrm>
+                    <a:prstGeom prst="rect"/>
+                  </pic:spPr>
+                </pic:pic>
+              </a:graphicData>
+            </a:graphic>
+          </wp:inline>
+        </w:drawing>
+      </w:r>
+    </w:p>
+    <w:p>
+      <w:pPr>
+        <w:spacing w:before="80" w:after="240"/>
+        <w:jc w:val="center"/>
+      </w:pPr>
+      <w:r>
+        <w:rPr>
+          <w:rFonts w:ascii="Calibri" w:hAnsi="Calibri" w:eastAsia="Calibri"/>
+          <w:b w:val="0"/>
+          <w:i/>
+          <w:color w:val="333333"/>
+          <w:sz w:val="20"/>
+        </w:rPr>
+        <w:t>Figure 5. GET /health — service ready with model_loaded=true and API version 2.1.0.</w:t>
+      </w:r>
+    </w:p>
+    <w:p>
+      <w:pPr>
+        <w:spacing w:before="120" w:after="40"/>
+        <w:jc w:val="center"/>
+      </w:pPr>
+      <w:r>
+        <w:drawing>
+          <wp:inline xmlns:a="http://schemas.openxmlformats.org/drawingml/2006/main" xmlns:pic="http://schemas.openxmlformats.org/drawingml/2006/picture">
+            <wp:extent cx="5760720" cy="3093608"/>
+            <wp:docPr id="6" name="Picture 6"/>
+            <wp:cNvGraphicFramePr>
+              <a:graphicFrameLocks noChangeAspect="1"/>
+            </wp:cNvGraphicFramePr>
+            <a:graphic>
+              <a:graphicData uri="http://schemas.openxmlformats.org/drawingml/2006/picture">
+                <pic:pic>
+                  <pic:nvPicPr>
+                    <pic:cNvPr id="0" name="APIExecution_Predict_1.png"/>
+                    <pic:cNvPicPr/>
+                  </pic:nvPicPr>
+                  <pic:blipFill>
+                    <a:blip r:embed="rId16"/>
+                    <a:stretch>
+                      <a:fillRect/>
+                    </a:stretch>
+                  </pic:blipFill>
+                  <pic:spPr>
+                    <a:xfrm>
+                      <a:off x="0" y="0"/>
+                      <a:ext cx="5760720" cy="3093608"/>
+                    </a:xfrm>
+                    <a:prstGeom prst="rect"/>
+                  </pic:spPr>
+                </pic:pic>
+              </a:graphicData>
+            </a:graphic>
+          </wp:inline>
+        </w:drawing>
+      </w:r>
+    </w:p>
+    <w:p>
+      <w:pPr>
+        <w:spacing w:before="80" w:after="240"/>
+        <w:jc w:val="center"/>
+      </w:pPr>
+      <w:r>
+        <w:rPr>
+          <w:rFonts w:ascii="Calibri" w:hAnsi="Calibri" w:eastAsia="Calibri"/>
+          <w:b w:val="0"/>
+          <w:i/>
+          <w:color w:val="333333"/>
+          <w:sz w:val="20"/>
+        </w:rPr>
+        <w:t>Figure 6. POST /v1/predictions — interactive request form (candidate_name, resume_text).</w:t>
+      </w:r>
+    </w:p>
+    <w:p>
+      <w:pPr>
+        <w:spacing w:before="120" w:after="40"/>
+        <w:jc w:val="center"/>
+      </w:pPr>
+      <w:r>
+        <w:drawing>
+          <wp:inline xmlns:a="http://schemas.openxmlformats.org/drawingml/2006/main" xmlns:pic="http://schemas.openxmlformats.org/drawingml/2006/picture">
+            <wp:extent cx="5760720" cy="3081594"/>
+            <wp:docPr id="7" name="Picture 7"/>
+            <wp:cNvGraphicFramePr>
+              <a:graphicFrameLocks noChangeAspect="1"/>
+            </wp:cNvGraphicFramePr>
+            <a:graphic>
+              <a:graphicData uri="http://schemas.openxmlformats.org/drawingml/2006/picture">
+                <pic:pic>
+                  <pic:nvPicPr>
+                    <pic:cNvPr id="0" name="APIExecution_Predict_2.png"/>
+                    <pic:cNvPicPr/>
+                  </pic:nvPicPr>
+                  <pic:blipFill>
+                    <a:blip r:embed="rId17"/>
+                    <a:stretch>
+                      <a:fillRect/>
+                    </a:stretch>
+                  </pic:blipFill>
+                  <pic:spPr>
+                    <a:xfrm>
+                      <a:off x="0" y="0"/>
+                      <a:ext cx="5760720" cy="3081594"/>
+                    </a:xfrm>
+                    <a:prstGeom prst="rect"/>
+                  </pic:spPr>
+                </pic:pic>
+              </a:graphicData>
+            </a:graphic>
+          </wp:inline>
+        </w:drawing>
+      </w:r>
+    </w:p>
+    <w:p>
+      <w:pPr>
+        <w:spacing w:before="80" w:after="240"/>
+        <w:jc w:val="center"/>
+      </w:pPr>
+      <w:r>
+        <w:rPr>
+          <w:rFonts w:ascii="Calibri" w:hAnsi="Calibri" w:eastAsia="Calibri"/>
+          <w:b w:val="0"/>
+          <w:i/>
+          <w:color w:val="333333"/>
+          <w:sz w:val="20"/>
+        </w:rPr>
+        <w:t>Figure 7. POST /v1/predictions — successful 200 response with predicted_role, confidence, role_ranking, explanation, and decision_note.</w:t>
       </w:r>
     </w:p>
     <w:p>
@@ -5602,215 +5992,7 @@
           <w:color w:val="333333"/>
           <w:sz w:val="20"/>
         </w:rPr>
-        <w:t>Figure 7. POST /v1/predictions — successful 200 response with predicted_role, confidence, role_ranking, explanation, and decision_note.</w:t>
-      </w:r>
-    </w:p>
-    <w:p>
-      <w:pPr>
-        <w:spacing w:before="120" w:after="40"/>
-        <w:jc w:val="center"/>
-      </w:pPr>
-      <w:r>
-        <w:drawing>
-          <wp:inline xmlns:a="http://schemas.openxmlformats.org/drawingml/2006/main" xmlns:pic="http://schemas.openxmlformats.org/drawingml/2006/picture">
-            <wp:extent cx="5760720" cy="3081594"/>
-            <wp:docPr id="7" name="Picture 7"/>
-            <wp:cNvGraphicFramePr>
-              <a:graphicFrameLocks noChangeAspect="1"/>
-            </wp:cNvGraphicFramePr>
-            <a:graphic>
-              <a:graphicData uri="http://schemas.openxmlformats.org/drawingml/2006/picture">
-                <pic:pic>
-                  <pic:nvPicPr>
-                    <pic:cNvPr id="0" name="APIExecution_Predict_2.png"/>
-                    <pic:cNvPicPr/>
-                  </pic:nvPicPr>
-                  <pic:blipFill>
-                    <a:blip r:embed="rId17"/>
-                    <a:stretch>
-                      <a:fillRect/>
-                    </a:stretch>
-                  </pic:blipFill>
-                  <pic:spPr>
-                    <a:xfrm>
-                      <a:off x="0" y="0"/>
-                      <a:ext cx="5760720" cy="3081594"/>
-                    </a:xfrm>
-                    <a:prstGeom prst="rect"/>
-                  </pic:spPr>
-                </pic:pic>
-              </a:graphicData>
-            </a:graphic>
-          </wp:inline>
-        </w:drawing>
-      </w:r>
-    </w:p>
-    <w:p>
-      <w:pPr>
-        <w:spacing w:before="80" w:after="240"/>
-        <w:jc w:val="center"/>
-      </w:pPr>
-      <w:r>
-        <w:rPr>
-          <w:rFonts w:ascii="Calibri" w:hAnsi="Calibri" w:eastAsia="Calibri"/>
-          <w:b w:val="0"/>
-          <w:i/>
-          <w:color w:val="333333"/>
-          <w:sz w:val="20"/>
-        </w:rPr>
-        <w:t>Figure 6. POST /v1/predictions — interactive request form (candidate_name, resume_text).</w:t>
-      </w:r>
-    </w:p>
-    <w:p>
-      <w:pPr>
-        <w:spacing w:before="120" w:after="40"/>
-        <w:jc w:val="center"/>
-      </w:pPr>
-      <w:r>
-        <w:drawing>
-          <wp:inline xmlns:a="http://schemas.openxmlformats.org/drawingml/2006/main" xmlns:pic="http://schemas.openxmlformats.org/drawingml/2006/picture">
-            <wp:extent cx="5760720" cy="3093608"/>
-            <wp:docPr id="6" name="Picture 6"/>
-            <wp:cNvGraphicFramePr>
-              <a:graphicFrameLocks noChangeAspect="1"/>
-            </wp:cNvGraphicFramePr>
-            <a:graphic>
-              <a:graphicData uri="http://schemas.openxmlformats.org/drawingml/2006/picture">
-                <pic:pic>
-                  <pic:nvPicPr>
-                    <pic:cNvPr id="0" name="APIExecution_Predict_1.png"/>
-                    <pic:cNvPicPr/>
-                  </pic:nvPicPr>
-                  <pic:blipFill>
-                    <a:blip r:embed="rId16"/>
-                    <a:stretch>
-                      <a:fillRect/>
-                    </a:stretch>
-                  </pic:blipFill>
-                  <pic:spPr>
-                    <a:xfrm>
-                      <a:off x="0" y="0"/>
-                      <a:ext cx="5760720" cy="3093608"/>
-                    </a:xfrm>
-                    <a:prstGeom prst="rect"/>
-                  </pic:spPr>
-                </pic:pic>
-              </a:graphicData>
-            </a:graphic>
-          </wp:inline>
-        </w:drawing>
-      </w:r>
-    </w:p>
-    <w:p>
-      <w:pPr>
-        <w:spacing w:before="80" w:after="240"/>
-        <w:jc w:val="center"/>
-      </w:pPr>
-      <w:r>
-        <w:rPr>
-          <w:rFonts w:ascii="Calibri" w:hAnsi="Calibri" w:eastAsia="Calibri"/>
-          <w:b w:val="0"/>
-          <w:i/>
-          <w:color w:val="333333"/>
-          <w:sz w:val="20"/>
-        </w:rPr>
-        <w:t>Figure 5. GET /health — service ready with model_loaded=true and API version 2.1.0.</w:t>
-      </w:r>
-    </w:p>
-    <w:p>
-      <w:pPr>
-        <w:spacing w:before="120" w:after="40"/>
-        <w:jc w:val="center"/>
-      </w:pPr>
-      <w:r>
-        <w:drawing>
-          <wp:inline xmlns:a="http://schemas.openxmlformats.org/drawingml/2006/main" xmlns:pic="http://schemas.openxmlformats.org/drawingml/2006/picture">
-            <wp:extent cx="5486400" cy="1133699"/>
-            <wp:docPr id="5" name="Picture 5"/>
-            <wp:cNvGraphicFramePr>
-              <a:graphicFrameLocks noChangeAspect="1"/>
-            </wp:cNvGraphicFramePr>
-            <a:graphic>
-              <a:graphicData uri="http://schemas.openxmlformats.org/drawingml/2006/picture">
-                <pic:pic>
-                  <pic:nvPicPr>
-                    <pic:cNvPr id="0" name="FastHeatlthCheck.png"/>
-                    <pic:cNvPicPr/>
-                  </pic:nvPicPr>
-                  <pic:blipFill>
-                    <a:blip r:embed="rId15"/>
-                    <a:stretch>
-                      <a:fillRect/>
-                    </a:stretch>
-                  </pic:blipFill>
-                  <pic:spPr>
-                    <a:xfrm>
-                      <a:off x="0" y="0"/>
-                      <a:ext cx="5486400" cy="1133699"/>
-                    </a:xfrm>
-                    <a:prstGeom prst="rect"/>
-                  </pic:spPr>
-                </pic:pic>
-              </a:graphicData>
-            </a:graphic>
-          </wp:inline>
-        </w:drawing>
-      </w:r>
-    </w:p>
-    <w:p>
-      <w:pPr>
-        <w:spacing w:before="80" w:after="240"/>
-        <w:jc w:val="center"/>
-      </w:pPr>
-      <w:r>
-        <w:rPr>
-          <w:rFonts w:ascii="Calibri" w:hAnsi="Calibri" w:eastAsia="Calibri"/>
-          <w:b w:val="0"/>
-          <w:i/>
-          <w:color w:val="333333"/>
-          <w:sz w:val="20"/>
-        </w:rPr>
-        <w:t>Figure 4. OpenAPI specification — GET /health, POST /v1/predictions, POST /predict, GET /metrics, and generated schema models.</w:t>
-      </w:r>
-    </w:p>
-    <w:p>
-      <w:pPr>
-        <w:spacing w:before="120" w:after="40"/>
-        <w:jc w:val="center"/>
-      </w:pPr>
-      <w:r>
-        <w:drawing>
-          <wp:inline xmlns:a="http://schemas.openxmlformats.org/drawingml/2006/main" xmlns:pic="http://schemas.openxmlformats.org/drawingml/2006/picture">
-            <wp:extent cx="5760720" cy="3084598"/>
-            <wp:docPr id="4" name="Picture 4"/>
-            <wp:cNvGraphicFramePr>
-              <a:graphicFrameLocks noChangeAspect="1"/>
-            </wp:cNvGraphicFramePr>
-            <a:graphic>
-              <a:graphicData uri="http://schemas.openxmlformats.org/drawingml/2006/picture">
-                <pic:pic>
-                  <pic:nvPicPr>
-                    <pic:cNvPr id="0" name="APISpec.png"/>
-                    <pic:cNvPicPr/>
-                  </pic:nvPicPr>
-                  <pic:blipFill>
-                    <a:blip r:embed="rId14"/>
-                    <a:stretch>
-                      <a:fillRect/>
-                    </a:stretch>
-                  </pic:blipFill>
-                  <pic:spPr>
-                    <a:xfrm>
-                      <a:off x="0" y="0"/>
-                      <a:ext cx="5760720" cy="3084598"/>
-                    </a:xfrm>
-                    <a:prstGeom prst="rect"/>
-                  </pic:spPr>
-                </pic:pic>
-              </a:graphicData>
-            </a:graphic>
-          </wp:inline>
-        </w:drawing>
+        <w:t>Figure 8. GET /metrics — persisted model and data quality snapshot used for release evidence and UI sidebar metrics.</w:t>
       </w:r>
     </w:p>
     <w:p>
@@ -5824,194 +6006,16 @@
           <w:i w:val="0"/>
           <w:sz w:val="22"/>
         </w:rPr>
-        <w:t>The FastAPI service exposes typed health, prediction, and metrics endpoints with OpenAPI documentation at /docs. Request and response schemas are defined in app/schemas.py; inference uses the same application service as Streamlit.</w:t>
-      </w:r>
-    </w:p>
-    <w:p>
-      <w:pPr>
-        <w:pStyle w:val="Heading2"/>
-      </w:pPr>
-      <w:r>
-        <w:rPr>
-          <w:rFonts w:ascii="Calibri" w:hAnsi="Calibri" w:eastAsia="Calibri"/>
-          <w:b/>
-          <w:i w:val="0"/>
-          <w:sz w:val="26"/>
-        </w:rPr>
-        <w:t>B. REST API (FastAPI / OpenAPI)</w:t>
-      </w:r>
-    </w:p>
-    <w:p>
-      <w:pPr>
-        <w:spacing w:before="80" w:after="240"/>
-        <w:jc w:val="center"/>
-      </w:pPr>
-      <w:r>
-        <w:rPr>
-          <w:rFonts w:ascii="Calibri" w:hAnsi="Calibri" w:eastAsia="Calibri"/>
-          <w:b w:val="0"/>
-          <w:i/>
-          <w:color w:val="333333"/>
-          <w:sz w:val="20"/>
-        </w:rPr>
-        <w:t>Figure 3. Sample resume analysis — predicted role, confidence, keyword explanation, advisory decision note, and role ranking table.</w:t>
-      </w:r>
-    </w:p>
-    <w:p>
-      <w:pPr>
-        <w:spacing w:before="120" w:after="40"/>
-        <w:jc w:val="center"/>
-      </w:pPr>
-      <w:r>
-        <w:drawing>
-          <wp:inline xmlns:a="http://schemas.openxmlformats.org/drawingml/2006/main" xmlns:pic="http://schemas.openxmlformats.org/drawingml/2006/picture">
-            <wp:extent cx="5760720" cy="3093608"/>
-            <wp:docPr id="3" name="Picture 3"/>
-            <wp:cNvGraphicFramePr>
-              <a:graphicFrameLocks noChangeAspect="1"/>
-            </wp:cNvGraphicFramePr>
-            <a:graphic>
-              <a:graphicData uri="http://schemas.openxmlformats.org/drawingml/2006/picture">
-                <pic:pic>
-                  <pic:nvPicPr>
-                    <pic:cNvPr id="0" name="AppSampleResume.png"/>
-                    <pic:cNvPicPr/>
-                  </pic:nvPicPr>
-                  <pic:blipFill>
-                    <a:blip r:embed="rId13"/>
-                    <a:stretch>
-                      <a:fillRect/>
-                    </a:stretch>
-                  </pic:blipFill>
-                  <pic:spPr>
-                    <a:xfrm>
-                      <a:off x="0" y="0"/>
-                      <a:ext cx="5760720" cy="3093608"/>
-                    </a:xfrm>
-                    <a:prstGeom prst="rect"/>
-                  </pic:spPr>
-                </pic:pic>
-              </a:graphicData>
-            </a:graphic>
-          </wp:inline>
-        </w:drawing>
-      </w:r>
-    </w:p>
-    <w:p>
-      <w:pPr>
-        <w:spacing w:before="80" w:after="240"/>
-        <w:jc w:val="center"/>
-      </w:pPr>
-      <w:r>
-        <w:rPr>
-          <w:rFonts w:ascii="Calibri" w:hAnsi="Calibri" w:eastAsia="Calibri"/>
-          <w:b w:val="0"/>
-          <w:i/>
-          <w:color w:val="333333"/>
-          <w:sz w:val="20"/>
-        </w:rPr>
-        <w:t>Figure 2. Main recruiter UI — upload/paste controls, verified model quality sidebar, and privacy-aware audit history (no raw resume text stored).</w:t>
-      </w:r>
-    </w:p>
-    <w:p>
-      <w:pPr>
-        <w:spacing w:before="120" w:after="40"/>
-        <w:jc w:val="center"/>
-      </w:pPr>
-      <w:r>
-        <w:drawing>
-          <wp:inline xmlns:a="http://schemas.openxmlformats.org/drawingml/2006/main" xmlns:pic="http://schemas.openxmlformats.org/drawingml/2006/picture">
-            <wp:extent cx="5760720" cy="3102619"/>
-            <wp:docPr id="2" name="Picture 2"/>
-            <wp:cNvGraphicFramePr>
-              <a:graphicFrameLocks noChangeAspect="1"/>
-            </wp:cNvGraphicFramePr>
-            <a:graphic>
-              <a:graphicData uri="http://schemas.openxmlformats.org/drawingml/2006/picture">
-                <pic:pic>
-                  <pic:nvPicPr>
-                    <pic:cNvPr id="0" name="MainApp.png"/>
-                    <pic:cNvPicPr/>
-                  </pic:nvPicPr>
-                  <pic:blipFill>
-                    <a:blip r:embed="rId12"/>
-                    <a:stretch>
-                      <a:fillRect/>
-                    </a:stretch>
-                  </pic:blipFill>
-                  <pic:spPr>
-                    <a:xfrm>
-                      <a:off x="0" y="0"/>
-                      <a:ext cx="5760720" cy="3102619"/>
-                    </a:xfrm>
-                    <a:prstGeom prst="rect"/>
-                  </pic:spPr>
-                </pic:pic>
-              </a:graphicData>
-            </a:graphic>
-          </wp:inline>
-        </w:drawing>
-      </w:r>
-    </w:p>
-    <w:p>
-      <w:pPr>
-        <w:spacing w:after="160"/>
-      </w:pPr>
-      <w:r>
-        <w:rPr>
-          <w:rFonts w:ascii="Calibri" w:hAnsi="Calibri" w:eastAsia="Calibri"/>
-          <w:b w:val="0"/>
-          <w:i w:val="0"/>
-          <w:sz w:val="22"/>
-        </w:rPr>
-        <w:t>The Streamlit app preserves the Assignment I workflow (candidate name, TXT/PDF/DOCX upload or paste, analysis, explanation, and audit history) while routing scoring through the shared modular ResumeScreeningApplication service.</w:t>
-      </w:r>
-    </w:p>
-    <w:p>
-      <w:pPr>
-        <w:pStyle w:val="Heading2"/>
-      </w:pPr>
-      <w:r>
-        <w:rPr>
-          <w:rFonts w:ascii="Calibri" w:hAnsi="Calibri" w:eastAsia="Calibri"/>
-          <w:b/>
-          <w:i w:val="0"/>
-          <w:sz w:val="26"/>
-        </w:rPr>
-        <w:t>A. Recruiter application (Streamlit)</w:t>
-      </w:r>
-    </w:p>
-    <w:p>
-      <w:pPr>
-        <w:spacing w:after="160"/>
-      </w:pPr>
-      <w:r>
-        <w:rPr>
-          <w:rFonts w:ascii="Calibri" w:hAnsi="Calibri" w:eastAsia="Calibri"/>
-          <w:b w:val="0"/>
-          <w:i w:val="0"/>
-          <w:sz w:val="22"/>
-        </w:rPr>
-        <w:t>The following screenshots demonstrate the running Assignment II system: the preserved recruiter UI (Streamlit) and the production-style FastAPI inference interface required by the assignment submission guidelines.</w:t>
+        <w:t>These screenshots, together with report/pytest_report.txt and report/lint_*.txt, constitute runtime evidence that the modular production package executes as described in Sections 5–8.</w:t>
       </w:r>
     </w:p>
     <w:p>
       <w:pPr>
         <w:pStyle w:val="Heading1"/>
+        <w:keepNext/>
       </w:pPr>
       <w:r>
-        <w:rPr>
-          <w:rFonts w:ascii="Calibri" w:hAnsi="Calibri" w:eastAsia="Calibri"/>
-          <w:b/>
-          <w:i w:val="0"/>
-          <w:sz w:val="32"/>
-        </w:rPr>
-        <w:t>Application screenshots</w:t>
-      </w:r>
-    </w:p>
-    <w:p>
-      <w:r>
-        <w:br w:type="page"/>
+        <w:t>11. Conclusion</w:t>
       </w:r>
     </w:p>
     <w:p>
@@ -6023,15 +6027,6 @@
           <w:rFonts w:ascii="Calibri" w:hAnsi="Calibri"/>
         </w:rPr>
         <w:t>The Assignment I prototype has been evolved into a feature-preserving, production-style ML system. The final package demonstrates explicit research-to-production separation, modular architecture, persistent artifacts, structured logging, robust validation, a typed REST API, multi-level automated testing, quality gates, privacy-aware audit history, and production experimentation planning.</w:t>
-      </w:r>
-    </w:p>
-    <w:p>
-      <w:pPr>
-        <w:pStyle w:val="Heading1"/>
-        <w:keepNext/>
-      </w:pPr>
-      <w:r>
-        <w:t>11. Conclusion</w:t>
       </w:r>
     </w:p>
     <w:p>

</xml_diff>

<commit_message>
Move canonical notebook to notebooks/179.ipynb.
Add project-root setup cells and update documentation and report references.
</commit_message>
<xml_diff>
--- a/report/179.docx
+++ b/report/179.docx
@@ -710,7 +710,7 @@
               <w:rPr>
                 <w:sz w:val="18"/>
               </w:rPr>
-              <w:t>179.ipynb, Section 3</w:t>
+              <w:t>notebooks/179.ipynb, Section 3</w:t>
             </w:r>
           </w:p>
         </w:tc>
@@ -1826,7 +1826,7 @@
     </w:p>
     <w:p>
       <w:r>
-        <w:t>The canonical 179.ipynb now demonstrates the same preprocessing component twice. The first version is deliberately notebook-oriented; the second imports the tested production function. It also records class/text-length EDA, compares MultinomialNB with logistic regression on one fixed split, and displays a classification report and confusion matrix before the production hand-off.</w:t>
+        <w:t>The canonical notebooks/179.ipynb now demonstrates the same preprocessing component twice. The first version is deliberately notebook-oriented; the second imports the tested production function. It also records class/text-length EDA, compares MultinomialNB with logistic regression on one fixed split, and displays a classification report and confusion matrix before the production hand-off.</w:t>
       </w:r>
     </w:p>
     <w:p>
@@ -1841,7 +1841,7 @@
           <w:color w:val="FFFFFF"/>
           <w:sz w:val="17"/>
         </w:rPr>
-        <w:t># Research prototype in 179.ipynb</w:t>
+        <w:t># Research prototype in notebooks/179.ipynb</w:t>
         <w:br/>
         <w:t>def prototype_clean_text(text):</w:t>
         <w:br/>
@@ -5959,7 +5959,7 @@
               <w:rPr>
                 <w:sz w:val="18"/>
               </w:rPr>
-              <w:t>179.ipynb</w:t>
+              <w:t>notebooks/179.ipynb</w:t>
             </w:r>
           </w:p>
         </w:tc>

</xml_diff>

<commit_message>
Use single root 179.ipynb as research/demo notebook.
Remove executed duplicate and notebooks/ layout. Update documentation.
</commit_message>
<xml_diff>
--- a/report/179.docx
+++ b/report/179.docx
@@ -1826,7 +1826,7 @@
     </w:p>
     <w:p>
       <w:r>
-        <w:t>The canonical notebooks/179.ipynb now demonstrates the same preprocessing component twice. The first version is deliberately notebook-oriented; the second imports the tested production function. It also records class/text-length EDA, compares MultinomialNB with logistic regression on one fixed split, and displays a classification report and confusion matrix before the production hand-off.</w:t>
+        <w:t>The canonical 179.ipynb now demonstrates the same preprocessing component twice. The first version is deliberately notebook-oriented; the second imports the tested production function. It also records class/text-length EDA, compares MultinomialNB with logistic regression on one fixed split, and displays a classification report and confusion matrix before the production hand-off.</w:t>
       </w:r>
     </w:p>
     <w:p>
@@ -1841,7 +1841,7 @@
           <w:color w:val="FFFFFF"/>
           <w:sz w:val="17"/>
         </w:rPr>
-        <w:t># Research prototype in notebooks/179.ipynb</w:t>
+        <w:t># Research prototype in 179.ipynb</w:t>
         <w:br/>
         <w:t>def prototype_clean_text(text):</w:t>
         <w:br/>
@@ -5952,14 +5952,8 @@
             <w:vAlign w:val="center"/>
           </w:tcPr>
           <w:p>
-            <w:pPr>
-              <w:spacing w:after="0" w:line="240" w:lineRule="auto"/>
-            </w:pPr>
-            <w:r>
-              <w:rPr>
-                <w:sz w:val="18"/>
-              </w:rPr>
-              <w:t>notebooks/179.ipynb</w:t>
+            <w:r>
+              <w:t>179.ipynb</w:t>
             </w:r>
           </w:p>
         </w:tc>
@@ -5975,14 +5969,8 @@
             <w:vAlign w:val="center"/>
           </w:tcPr>
           <w:p>
-            <w:pPr>
-              <w:spacing w:after="0" w:line="240" w:lineRule="auto"/>
-            </w:pPr>
-            <w:r>
-              <w:rPr>
-                <w:sz w:val="18"/>
-              </w:rPr>
-              <w:t>Canonical implementation notebook</w:t>
+            <w:r>
+              <w:t>Required assignment notebook; research/demo path (production code in ml/, services/, app/)</w:t>
             </w:r>
           </w:p>
         </w:tc>
@@ -6003,15 +5991,7 @@
             <w:vAlign w:val="center"/>
           </w:tcPr>
           <w:p>
-            <w:pPr>
-              <w:spacing w:after="0" w:line="240" w:lineRule="auto"/>
-            </w:pPr>
-            <w:r>
-              <w:rPr>
-                <w:sz w:val="18"/>
-              </w:rPr>
-              <w:t>179_executed.ipynb</w:t>
-            </w:r>
+            <w:r/>
           </w:p>
         </w:tc>
         <w:tc>
@@ -6026,15 +6006,7 @@
             <w:vAlign w:val="center"/>
           </w:tcPr>
           <w:p>
-            <w:pPr>
-              <w:spacing w:after="0" w:line="240" w:lineRule="auto"/>
-            </w:pPr>
-            <w:r>
-              <w:rPr>
-                <w:sz w:val="18"/>
-              </w:rPr>
-              <w:t>Notebook with verified outputs</w:t>
-            </w:r>
+            <w:r/>
           </w:p>
         </w:tc>
       </w:tr>

</xml_diff>